<commit_message>
Design Brief: add 'Where This Is Headed' section (two pages now) — long-term vision plus a seven-row build-this-seam-now table translating the Engineering Considerations Catalog into engineer-facing guidance
</commit_message>
<xml_diff>
--- a/Ministry/Technology/CiC_FrontEnd_Design_Brief_V1_0.docx
+++ b/Ministry/Technology/CiC_FrontEnd_Design_Brief_V1_0.docx
@@ -51,7 +51,7 @@
           <w:sz w:val="15"/>
           <w:szCs w:val="15"/>
         </w:rPr>
-        <w:t xml:space="preserve">July 2026 · One to two pages, by design — ask for the full Front-End Vision &amp; Phased Plan or Experience Vision for more texture</w:t>
+        <w:t xml:space="preserve">July 2026 · Longer than a one-pager where the long view changes how Phase 1 should be built — the full Front-End Vision &amp; Phased Plan and Experience Vision have more texture if you want it</w:t>
       </w:r>
     </w:p>
     <w:p>
@@ -916,6 +916,638 @@
           <w:sz w:val="21"/>
           <w:szCs w:val="21"/>
         </w:rPr>
+        <w:t xml:space="preserve">Where This Is Headed (So You Don’t Build a Trap)</w:t>
+      </w:r>
+    </w:p>
+    <w:p>
+      <w:pPr>
+        <w:spacing w:after="100" w:line="250"/>
+      </w:pPr>
+      <w:r>
+        <w:rPr>
+          <w:rFonts w:ascii="Arial" w:cs="Arial" w:eastAsia="Arial" w:hAnsi="Arial"/>
+          <w:sz w:val="18"/>
+          <w:szCs w:val="18"/>
+        </w:rPr>
+        <w:t xml:space="preserve">Phase 1 launches five worlds. The project doesn’t stop there — and knowing the shape of what comes next should change a few structural choices now, even though none of the features below need to be built yet.</w:t>
+      </w:r>
+    </w:p>
+    <w:p>
+      <w:pPr>
+        <w:spacing w:after="100" w:line="250"/>
+      </w:pPr>
+      <w:r>
+        <w:rPr>
+          <w:rFonts w:ascii="Arial" w:cs="Arial" w:eastAsia="Arial" w:hAnsi="Arial"/>
+          <w:sz w:val="18"/>
+          <w:szCs w:val="18"/>
+        </w:rPr>
+        <w:t xml:space="preserve">The catalog eventually grows to 50–100 worlds spanning all of history and today, not just the Ancient Church set. Worlds stop being a flat list and become a real timeline — in the spirit of a Bible-timeline chart, not a literal map — positioned at their real historical moment, with contemporaries visible in parallel lanes and lines drawn between worlds that shaped each other. Worlds can be pulled to the same Table across eras, not just within one period.</w:t>
+      </w:r>
+    </w:p>
+    <w:p>
+      <w:pPr>
+        <w:spacing w:after="100" w:line="250"/>
+      </w:pPr>
+      <w:r>
+        <w:rPr>
+          <w:rFonts w:ascii="Arial" w:cs="Arial" w:eastAsia="Arial" w:hAnsi="Arial"/>
+          <w:sz w:val="18"/>
+          <w:szCs w:val="18"/>
+        </w:rPr>
+        <w:t xml:space="preserve">Clicking into a world eventually opens four choices, not one: Description, Tour, Choose for Table, and Academic Documents. Only Choose for Table is real at Phase 1. Academic Documents is a future standalone feature — raw, unmodified browsing of a world’s full lexicon, story repository, and source documents, independent of any conversation, distinct from the in-conversation hover/click (which stays free for everyone, permanently — a constitutional guarantee, never gated). Tours is a Representative guiding a participant through pictures of their world, potentially a church service or the Eucharist, bounded by the same evidence rule as everything else. Today’s "first pass" voice matures into fully culturally- and gender-matched, multilingual text-to-speech as funding allows.</w:t>
+      </w:r>
+    </w:p>
+    <w:p>
+      <w:pPr>
+        <w:spacing w:after="100" w:line="250"/>
+      </w:pPr>
+      <w:r>
+        <w:rPr>
+          <w:rFonts w:ascii="Arial" w:cs="Arial" w:eastAsia="Arial" w:hAnsi="Arial"/>
+          <w:sz w:val="18"/>
+          <w:szCs w:val="18"/>
+        </w:rPr>
+        <w:t xml:space="preserve">On funding: the core conversation stays free for everyone, donor-funded, permanently — that’s a constitutional guarantee, not a pricing choice that might change. A future paid tier may eventually unlock deeper pastor and academic tooling (Tours, sermon-prep material, Academic Documents) on top of that free core. That means some notion of user identity or entitlement is worth existing early, even completely unused at Phase 1.</w:t>
+      </w:r>
+    </w:p>
+    <w:p>
+      <w:pPr>
+        <w:spacing w:after="100" w:line="250"/>
+      </w:pPr>
+      <w:r>
+        <w:rPr>
+          <w:rFonts w:ascii="Arial" w:cs="Arial" w:eastAsia="Arial" w:hAnsi="Arial"/>
+          <w:sz w:val="18"/>
+          <w:szCs w:val="18"/>
+        </w:rPr>
+        <w:t xml:space="preserve">None of this is Phase 1 scope. All of it is Phase 1 architecture. The difference between a seam and a feature is that a seam costs almost nothing to leave in now and a lot to add back later — that’s the whole list below.</w:t>
+      </w:r>
+    </w:p>
+    <w:tbl>
+      <w:tblPr>
+        <w:tblW w:type="dxa" w:w="9360"/>
+        <w:tblBorders>
+          <w:top w:val="single" w:color="auto" w:sz="4"/>
+          <w:left w:val="single" w:color="auto" w:sz="4"/>
+          <w:bottom w:val="single" w:color="auto" w:sz="4"/>
+          <w:right w:val="single" w:color="auto" w:sz="4"/>
+          <w:insideH w:val="single" w:color="auto" w:sz="4"/>
+          <w:insideV w:val="single" w:color="auto" w:sz="4"/>
+        </w:tblBorders>
+      </w:tblPr>
+      <w:tblGrid>
+        <w:gridCol w:w="4680"/>
+        <w:gridCol w:w="4680"/>
+      </w:tblGrid>
+      <w:tr>
+        <w:trPr>
+          <w:tblHeader/>
+        </w:trPr>
+        <w:tc>
+          <w:tcPr>
+            <w:tcW w:type="dxa" w:w="4680"/>
+            <w:tcBorders>
+              <w:top w:val="single" w:color="CCCCCC" w:sz="1"/>
+              <w:left w:val="single" w:color="CCCCCC" w:sz="1"/>
+              <w:bottom w:val="single" w:color="CCCCCC" w:sz="1"/>
+              <w:right w:val="single" w:color="CCCCCC" w:sz="1"/>
+            </w:tcBorders>
+            <w:shd w:fill="1F3864" w:val="clear"/>
+            <w:tcMar>
+              <w:top w:type="dxa" w:w="60"/>
+              <w:left w:type="dxa" w:w="100"/>
+              <w:bottom w:type="dxa" w:w="60"/>
+              <w:right w:type="dxa" w:w="100"/>
+            </w:tcMar>
+          </w:tcPr>
+          <w:p>
+            <w:r>
+              <w:rPr>
+                <w:rFonts w:ascii="Arial" w:cs="Arial" w:eastAsia="Arial" w:hAnsi="Arial"/>
+                <w:b/>
+                <w:bCs/>
+                <w:color w:val="FFFFFF"/>
+                <w:sz w:val="16"/>
+                <w:szCs w:val="16"/>
+              </w:rPr>
+              <w:t xml:space="preserve">Build this seam now (cheap)</w:t>
+            </w:r>
+          </w:p>
+        </w:tc>
+        <w:tc>
+          <w:tcPr>
+            <w:tcW w:type="dxa" w:w="4680"/>
+            <w:tcBorders>
+              <w:top w:val="single" w:color="CCCCCC" w:sz="1"/>
+              <w:left w:val="single" w:color="CCCCCC" w:sz="1"/>
+              <w:bottom w:val="single" w:color="CCCCCC" w:sz="1"/>
+              <w:right w:val="single" w:color="CCCCCC" w:sz="1"/>
+            </w:tcBorders>
+            <w:shd w:fill="1F3864" w:val="clear"/>
+            <w:tcMar>
+              <w:top w:type="dxa" w:w="60"/>
+              <w:left w:type="dxa" w:w="100"/>
+              <w:bottom w:type="dxa" w:w="60"/>
+              <w:right w:type="dxa" w:w="100"/>
+            </w:tcMar>
+          </w:tcPr>
+          <w:p>
+            <w:r>
+              <w:rPr>
+                <w:rFonts w:ascii="Arial" w:cs="Arial" w:eastAsia="Arial" w:hAnsi="Arial"/>
+                <w:b/>
+                <w:bCs/>
+                <w:color w:val="FFFFFF"/>
+                <w:sz w:val="16"/>
+                <w:szCs w:val="16"/>
+              </w:rPr>
+              <w:t xml:space="preserve">Because this needs it eventually (expensive to retrofit)</w:t>
+            </w:r>
+          </w:p>
+        </w:tc>
+      </w:tr>
+      <w:tr>
+        <w:tc>
+          <w:tcPr>
+            <w:tcW w:type="dxa" w:w="4680"/>
+            <w:tcBorders>
+              <w:top w:val="single" w:color="CCCCCC" w:sz="1"/>
+              <w:left w:val="single" w:color="CCCCCC" w:sz="1"/>
+              <w:bottom w:val="single" w:color="CCCCCC" w:sz="1"/>
+              <w:right w:val="single" w:color="CCCCCC" w:sz="1"/>
+            </w:tcBorders>
+            <w:shd w:fill="F2F2F2" w:val="clear"/>
+            <w:tcMar>
+              <w:top w:type="dxa" w:w="60"/>
+              <w:left w:type="dxa" w:w="100"/>
+              <w:bottom w:type="dxa" w:w="60"/>
+              <w:right w:type="dxa" w:w="100"/>
+            </w:tcMar>
+          </w:tcPr>
+          <w:p>
+            <w:pPr>
+              <w:spacing w:line="230"/>
+            </w:pPr>
+            <w:r>
+              <w:rPr>
+                <w:rFonts w:ascii="Arial" w:cs="Arial" w:eastAsia="Arial" w:hAnsi="Arial"/>
+                <w:sz w:val="16"/>
+                <w:szCs w:val="16"/>
+              </w:rPr>
+              <w:t xml:space="preserve">World data fields (temporal range, region, “shaped-by” relationships) on every world record, even unused</w:t>
+            </w:r>
+          </w:p>
+        </w:tc>
+        <w:tc>
+          <w:tcPr>
+            <w:tcW w:type="dxa" w:w="4680"/>
+            <w:tcBorders>
+              <w:top w:val="single" w:color="CCCCCC" w:sz="1"/>
+              <w:left w:val="single" w:color="CCCCCC" w:sz="1"/>
+              <w:bottom w:val="single" w:color="CCCCCC" w:sz="1"/>
+              <w:right w:val="single" w:color="CCCCCC" w:sz="1"/>
+            </w:tcBorders>
+            <w:shd w:fill="F2F2F2" w:val="clear"/>
+            <w:tcMar>
+              <w:top w:type="dxa" w:w="60"/>
+              <w:left w:type="dxa" w:w="100"/>
+              <w:bottom w:type="dxa" w:w="60"/>
+              <w:right w:type="dxa" w:w="100"/>
+            </w:tcMar>
+          </w:tcPr>
+          <w:p>
+            <w:pPr>
+              <w:spacing w:line="230"/>
+            </w:pPr>
+            <w:r>
+              <w:rPr>
+                <w:rFonts w:ascii="Arial" w:cs="Arial" w:eastAsia="Arial" w:hAnsi="Arial"/>
+                <w:sz w:val="16"/>
+                <w:szCs w:val="16"/>
+              </w:rPr>
+              <w:t xml:space="preserve">So the future World Map is a visualization layer over data that already exists, not a data-collection project across every already-live world.</w:t>
+            </w:r>
+          </w:p>
+        </w:tc>
+      </w:tr>
+      <w:tr>
+        <w:tc>
+          <w:tcPr>
+            <w:tcW w:type="dxa" w:w="4680"/>
+            <w:tcBorders>
+              <w:top w:val="single" w:color="CCCCCC" w:sz="1"/>
+              <w:left w:val="single" w:color="CCCCCC" w:sz="1"/>
+              <w:bottom w:val="single" w:color="CCCCCC" w:sz="1"/>
+              <w:right w:val="single" w:color="CCCCCC" w:sz="1"/>
+            </w:tcBorders>
+            <w:shd w:fill="FFFFFF" w:val="clear"/>
+            <w:tcMar>
+              <w:top w:type="dxa" w:w="60"/>
+              <w:left w:type="dxa" w:w="100"/>
+              <w:bottom w:type="dxa" w:w="60"/>
+              <w:right w:type="dxa" w:w="100"/>
+            </w:tcMar>
+          </w:tcPr>
+          <w:p>
+            <w:pPr>
+              <w:spacing w:line="230"/>
+            </w:pPr>
+            <w:r>
+              <w:rPr>
+                <w:rFonts w:ascii="Arial" w:cs="Arial" w:eastAsia="Arial" w:hAnsi="Arial"/>
+                <w:sz w:val="16"/>
+                <w:szCs w:val="16"/>
+              </w:rPr>
+              <w:t xml:space="preserve">Retrieval called through one clean interface, not hardwired rule-matching everywhere it’s used</w:t>
+            </w:r>
+          </w:p>
+        </w:tc>
+        <w:tc>
+          <w:tcPr>
+            <w:tcW w:type="dxa" w:w="4680"/>
+            <w:tcBorders>
+              <w:top w:val="single" w:color="CCCCCC" w:sz="1"/>
+              <w:left w:val="single" w:color="CCCCCC" w:sz="1"/>
+              <w:bottom w:val="single" w:color="CCCCCC" w:sz="1"/>
+              <w:right w:val="single" w:color="CCCCCC" w:sz="1"/>
+            </w:tcBorders>
+            <w:shd w:fill="FFFFFF" w:val="clear"/>
+            <w:tcMar>
+              <w:top w:type="dxa" w:w="60"/>
+              <w:left w:type="dxa" w:w="100"/>
+              <w:bottom w:type="dxa" w:w="60"/>
+              <w:right w:type="dxa" w:w="100"/>
+            </w:tcMar>
+          </w:tcPr>
+          <w:p>
+            <w:pPr>
+              <w:spacing w:line="230"/>
+            </w:pPr>
+            <w:r>
+              <w:rPr>
+                <w:rFonts w:ascii="Arial" w:cs="Arial" w:eastAsia="Arial" w:hAnsi="Arial"/>
+                <w:sz w:val="16"/>
+                <w:szCs w:val="16"/>
+              </w:rPr>
+              <w:t xml:space="preserve">Swapping to smarter (semantic) search later becomes a single change behind that interface, not a rewrite of every place retrieval is called.</w:t>
+            </w:r>
+          </w:p>
+        </w:tc>
+      </w:tr>
+      <w:tr>
+        <w:tc>
+          <w:tcPr>
+            <w:tcW w:type="dxa" w:w="4680"/>
+            <w:tcBorders>
+              <w:top w:val="single" w:color="CCCCCC" w:sz="1"/>
+              <w:left w:val="single" w:color="CCCCCC" w:sz="1"/>
+              <w:bottom w:val="single" w:color="CCCCCC" w:sz="1"/>
+              <w:right w:val="single" w:color="CCCCCC" w:sz="1"/>
+            </w:tcBorders>
+            <w:shd w:fill="F2F2F2" w:val="clear"/>
+            <w:tcMar>
+              <w:top w:type="dxa" w:w="60"/>
+              <w:left w:type="dxa" w:w="100"/>
+              <w:bottom w:type="dxa" w:w="60"/>
+              <w:right w:type="dxa" w:w="100"/>
+            </w:tcMar>
+          </w:tcPr>
+          <w:p>
+            <w:pPr>
+              <w:spacing w:line="230"/>
+            </w:pPr>
+            <w:r>
+              <w:rPr>
+                <w:rFonts w:ascii="Arial" w:cs="Arial" w:eastAsia="Arial" w:hAnsi="Arial"/>
+                <w:sz w:val="16"/>
+                <w:szCs w:val="16"/>
+              </w:rPr>
+              <w:t xml:space="preserve">The world-click UI built as a real four-option menu now, with three options visibly disabled</w:t>
+            </w:r>
+          </w:p>
+        </w:tc>
+        <w:tc>
+          <w:tcPr>
+            <w:tcW w:type="dxa" w:w="4680"/>
+            <w:tcBorders>
+              <w:top w:val="single" w:color="CCCCCC" w:sz="1"/>
+              <w:left w:val="single" w:color="CCCCCC" w:sz="1"/>
+              <w:bottom w:val="single" w:color="CCCCCC" w:sz="1"/>
+              <w:right w:val="single" w:color="CCCCCC" w:sz="1"/>
+            </w:tcBorders>
+            <w:shd w:fill="F2F2F2" w:val="clear"/>
+            <w:tcMar>
+              <w:top w:type="dxa" w:w="60"/>
+              <w:left w:type="dxa" w:w="100"/>
+              <w:bottom w:type="dxa" w:w="60"/>
+              <w:right w:type="dxa" w:w="100"/>
+            </w:tcMar>
+          </w:tcPr>
+          <w:p>
+            <w:pPr>
+              <w:spacing w:line="230"/>
+            </w:pPr>
+            <w:r>
+              <w:rPr>
+                <w:rFonts w:ascii="Arial" w:cs="Arial" w:eastAsia="Arial" w:hAnsi="Arial"/>
+                <w:sz w:val="16"/>
+                <w:szCs w:val="16"/>
+              </w:rPr>
+              <w:t xml:space="preserve">Description, Tour, and Academic Documents activate later by turning a flag on, not by rebuilding the menu concept from scratch.</w:t>
+            </w:r>
+          </w:p>
+        </w:tc>
+      </w:tr>
+      <w:tr>
+        <w:tc>
+          <w:tcPr>
+            <w:tcW w:type="dxa" w:w="4680"/>
+            <w:tcBorders>
+              <w:top w:val="single" w:color="CCCCCC" w:sz="1"/>
+              <w:left w:val="single" w:color="CCCCCC" w:sz="1"/>
+              <w:bottom w:val="single" w:color="CCCCCC" w:sz="1"/>
+              <w:right w:val="single" w:color="CCCCCC" w:sz="1"/>
+            </w:tcBorders>
+            <w:shd w:fill="FFFFFF" w:val="clear"/>
+            <w:tcMar>
+              <w:top w:type="dxa" w:w="60"/>
+              <w:left w:type="dxa" w:w="100"/>
+              <w:bottom w:type="dxa" w:w="60"/>
+              <w:right w:type="dxa" w:w="100"/>
+            </w:tcMar>
+          </w:tcPr>
+          <w:p>
+            <w:pPr>
+              <w:spacing w:line="230"/>
+            </w:pPr>
+            <w:r>
+              <w:rPr>
+                <w:rFonts w:ascii="Arial" w:cs="Arial" w:eastAsia="Arial" w:hAnsi="Arial"/>
+                <w:sz w:val="16"/>
+                <w:szCs w:val="16"/>
+              </w:rPr>
+              <w:t xml:space="preserve">A role/entitlement field on sessions or users, even if nothing is gated yet</w:t>
+            </w:r>
+          </w:p>
+        </w:tc>
+        <w:tc>
+          <w:tcPr>
+            <w:tcW w:type="dxa" w:w="4680"/>
+            <w:tcBorders>
+              <w:top w:val="single" w:color="CCCCCC" w:sz="1"/>
+              <w:left w:val="single" w:color="CCCCCC" w:sz="1"/>
+              <w:bottom w:val="single" w:color="CCCCCC" w:sz="1"/>
+              <w:right w:val="single" w:color="CCCCCC" w:sz="1"/>
+            </w:tcBorders>
+            <w:shd w:fill="FFFFFF" w:val="clear"/>
+            <w:tcMar>
+              <w:top w:type="dxa" w:w="60"/>
+              <w:left w:type="dxa" w:w="100"/>
+              <w:bottom w:type="dxa" w:w="60"/>
+              <w:right w:type="dxa" w:w="100"/>
+            </w:tcMar>
+          </w:tcPr>
+          <w:p>
+            <w:pPr>
+              <w:spacing w:line="230"/>
+            </w:pPr>
+            <w:r>
+              <w:rPr>
+                <w:rFonts w:ascii="Arial" w:cs="Arial" w:eastAsia="Arial" w:hAnsi="Arial"/>
+                <w:sz w:val="16"/>
+                <w:szCs w:val="16"/>
+              </w:rPr>
+              <w:t xml:space="preserve">A future paid tier becomes a flag flip against an existing field, not a bolt-on identity system built under time pressure.</w:t>
+            </w:r>
+          </w:p>
+        </w:tc>
+      </w:tr>
+      <w:tr>
+        <w:tc>
+          <w:tcPr>
+            <w:tcW w:type="dxa" w:w="4680"/>
+            <w:tcBorders>
+              <w:top w:val="single" w:color="CCCCCC" w:sz="1"/>
+              <w:left w:val="single" w:color="CCCCCC" w:sz="1"/>
+              <w:bottom w:val="single" w:color="CCCCCC" w:sz="1"/>
+              <w:right w:val="single" w:color="CCCCCC" w:sz="1"/>
+            </w:tcBorders>
+            <w:shd w:fill="F2F2F2" w:val="clear"/>
+            <w:tcMar>
+              <w:top w:type="dxa" w:w="60"/>
+              <w:left w:type="dxa" w:w="100"/>
+              <w:bottom w:type="dxa" w:w="60"/>
+              <w:right w:type="dxa" w:w="100"/>
+            </w:tcMar>
+          </w:tcPr>
+          <w:p>
+            <w:pPr>
+              <w:spacing w:line="230"/>
+            </w:pPr>
+            <w:r>
+              <w:rPr>
+                <w:rFonts w:ascii="Arial" w:cs="Arial" w:eastAsia="Arial" w:hAnsi="Arial"/>
+                <w:sz w:val="16"/>
+                <w:szCs w:val="16"/>
+              </w:rPr>
+              <w:t xml:space="preserve">The real voice pipeline built now, pointed at a cheap voice</w:t>
+            </w:r>
+          </w:p>
+        </w:tc>
+        <w:tc>
+          <w:tcPr>
+            <w:tcW w:type="dxa" w:w="4680"/>
+            <w:tcBorders>
+              <w:top w:val="single" w:color="CCCCCC" w:sz="1"/>
+              <w:left w:val="single" w:color="CCCCCC" w:sz="1"/>
+              <w:bottom w:val="single" w:color="CCCCCC" w:sz="1"/>
+              <w:right w:val="single" w:color="CCCCCC" w:sz="1"/>
+            </w:tcBorders>
+            <w:shd w:fill="F2F2F2" w:val="clear"/>
+            <w:tcMar>
+              <w:top w:type="dxa" w:w="60"/>
+              <w:left w:type="dxa" w:w="100"/>
+              <w:bottom w:type="dxa" w:w="60"/>
+              <w:right w:type="dxa" w:w="100"/>
+            </w:tcMar>
+          </w:tcPr>
+          <w:p>
+            <w:pPr>
+              <w:spacing w:line="230"/>
+            </w:pPr>
+            <w:r>
+              <w:rPr>
+                <w:rFonts w:ascii="Arial" w:cs="Arial" w:eastAsia="Arial" w:hAnsi="Arial"/>
+                <w:sz w:val="16"/>
+                <w:szCs w:val="16"/>
+              </w:rPr>
+              <w:t xml:space="preserve">Richer, culturally-matched casting later is a configuration change — swap the voice model — not new plumbing.</w:t>
+            </w:r>
+          </w:p>
+        </w:tc>
+      </w:tr>
+      <w:tr>
+        <w:tc>
+          <w:tcPr>
+            <w:tcW w:type="dxa" w:w="4680"/>
+            <w:tcBorders>
+              <w:top w:val="single" w:color="CCCCCC" w:sz="1"/>
+              <w:left w:val="single" w:color="CCCCCC" w:sz="1"/>
+              <w:bottom w:val="single" w:color="CCCCCC" w:sz="1"/>
+              <w:right w:val="single" w:color="CCCCCC" w:sz="1"/>
+            </w:tcBorders>
+            <w:shd w:fill="FFFFFF" w:val="clear"/>
+            <w:tcMar>
+              <w:top w:type="dxa" w:w="60"/>
+              <w:left w:type="dxa" w:w="100"/>
+              <w:bottom w:type="dxa" w:w="60"/>
+              <w:right w:type="dxa" w:w="100"/>
+            </w:tcMar>
+          </w:tcPr>
+          <w:p>
+            <w:pPr>
+              <w:spacing w:line="230"/>
+            </w:pPr>
+            <w:r>
+              <w:rPr>
+                <w:rFonts w:ascii="Arial" w:cs="Arial" w:eastAsia="Arial" w:hAnsi="Arial"/>
+                <w:sz w:val="16"/>
+                <w:szCs w:val="16"/>
+              </w:rPr>
+              <w:t xml:space="preserve">A version tag on each world’s content in the runtime session</w:t>
+            </w:r>
+          </w:p>
+        </w:tc>
+        <w:tc>
+          <w:tcPr>
+            <w:tcW w:type="dxa" w:w="4680"/>
+            <w:tcBorders>
+              <w:top w:val="single" w:color="CCCCCC" w:sz="1"/>
+              <w:left w:val="single" w:color="CCCCCC" w:sz="1"/>
+              <w:bottom w:val="single" w:color="CCCCCC" w:sz="1"/>
+              <w:right w:val="single" w:color="CCCCCC" w:sz="1"/>
+            </w:tcBorders>
+            <w:shd w:fill="FFFFFF" w:val="clear"/>
+            <w:tcMar>
+              <w:top w:type="dxa" w:w="60"/>
+              <w:left w:type="dxa" w:w="100"/>
+              <w:bottom w:type="dxa" w:w="60"/>
+              <w:right w:type="dxa" w:w="100"/>
+            </w:tcMar>
+          </w:tcPr>
+          <w:p>
+            <w:pPr>
+              <w:spacing w:line="230"/>
+            </w:pPr>
+            <w:r>
+              <w:rPr>
+                <w:rFonts w:ascii="Arial" w:cs="Arial" w:eastAsia="Arial" w:hAnsi="Arial"/>
+                <w:sz w:val="16"/>
+                <w:szCs w:val="16"/>
+              </w:rPr>
+              <w:t xml:space="preserve">A world’s content can be revised after launch without a full app redeploy or breaking a conversation already in progress.</w:t>
+            </w:r>
+          </w:p>
+        </w:tc>
+      </w:tr>
+      <w:tr>
+        <w:tc>
+          <w:tcPr>
+            <w:tcW w:type="dxa" w:w="4680"/>
+            <w:tcBorders>
+              <w:top w:val="single" w:color="CCCCCC" w:sz="1"/>
+              <w:left w:val="single" w:color="CCCCCC" w:sz="1"/>
+              <w:bottom w:val="single" w:color="CCCCCC" w:sz="1"/>
+              <w:right w:val="single" w:color="CCCCCC" w:sz="1"/>
+            </w:tcBorders>
+            <w:shd w:fill="F2F2F2" w:val="clear"/>
+            <w:tcMar>
+              <w:top w:type="dxa" w:w="60"/>
+              <w:left w:type="dxa" w:w="100"/>
+              <w:bottom w:type="dxa" w:w="60"/>
+              <w:right w:type="dxa" w:w="100"/>
+            </w:tcMar>
+          </w:tcPr>
+          <w:p>
+            <w:pPr>
+              <w:spacing w:line="230"/>
+            </w:pPr>
+            <w:r>
+              <w:rPr>
+                <w:rFonts w:ascii="Arial" w:cs="Arial" w:eastAsia="Arial" w:hAnsi="Arial"/>
+                <w:sz w:val="16"/>
+                <w:szCs w:val="16"/>
+              </w:rPr>
+              <w:t xml:space="preserve">One written, coherent policy on what conversation data is logged and why, before Alpha testing starts</w:t>
+            </w:r>
+          </w:p>
+        </w:tc>
+        <w:tc>
+          <w:tcPr>
+            <w:tcW w:type="dxa" w:w="4680"/>
+            <w:tcBorders>
+              <w:top w:val="single" w:color="CCCCCC" w:sz="1"/>
+              <w:left w:val="single" w:color="CCCCCC" w:sz="1"/>
+              <w:bottom w:val="single" w:color="CCCCCC" w:sz="1"/>
+              <w:right w:val="single" w:color="CCCCCC" w:sz="1"/>
+            </w:tcBorders>
+            <w:shd w:fill="F2F2F2" w:val="clear"/>
+            <w:tcMar>
+              <w:top w:type="dxa" w:w="60"/>
+              <w:left w:type="dxa" w:w="100"/>
+              <w:bottom w:type="dxa" w:w="60"/>
+              <w:right w:type="dxa" w:w="100"/>
+            </w:tcMar>
+          </w:tcPr>
+          <w:p>
+            <w:pPr>
+              <w:spacing w:line="230"/>
+            </w:pPr>
+            <w:r>
+              <w:rPr>
+                <w:rFonts w:ascii="Arial" w:cs="Arial" w:eastAsia="Arial" w:hAnsi="Arial"/>
+                <w:sz w:val="16"/>
+                <w:szCs w:val="16"/>
+              </w:rPr>
+              <w:t xml:space="preserve">Internal quality review genuinely needs real conversation logs; that can’t be retrofitted honestly once people have already talked without knowing.</w:t>
+            </w:r>
+          </w:p>
+        </w:tc>
+      </w:tr>
+    </w:tbl>
+    <w:p>
+      <w:pPr>
+        <w:spacing w:after="0" w:before="120" w:line="230"/>
+      </w:pPr>
+      <w:r>
+        <w:rPr>
+          <w:rFonts w:ascii="Arial" w:cs="Arial" w:eastAsia="Arial" w:hAnsi="Arial"/>
+          <w:i/>
+          <w:iCs/>
+          <w:color w:val="595959"/>
+          <w:sz w:val="15"/>
+          <w:szCs w:val="15"/>
+        </w:rPr>
+        <w:t xml:space="preserve">Full detail behind each seam lives in Project-Reference/CiC_Engineering_Considerations_Catalog_V1_0.md — ask for it directly if you want the reasoning behind any one row.</w:t>
+      </w:r>
+    </w:p>
+    <w:p>
+      <w:pPr>
+        <w:pBdr>
+          <w:bottom w:val="single" w:color="8FAADC" w:sz="4" w:space="2"/>
+        </w:pBdr>
+        <w:spacing w:after="60" w:before="160"/>
+      </w:pPr>
+      <w:r>
+        <w:rPr>
+          <w:rFonts w:ascii="Arial" w:cs="Arial" w:eastAsia="Arial" w:hAnsi="Arial"/>
+          <w:b/>
+          <w:bCs/>
+          <w:color w:val="1F3864"/>
+          <w:sz w:val="21"/>
+          <w:szCs w:val="21"/>
+        </w:rPr>
         <w:t xml:space="preserve">Design Constraints Worth Knowing Before You Start</w:t>
       </w:r>
     </w:p>
@@ -970,7 +1602,7 @@
           <w:sz w:val="18"/>
           <w:szCs w:val="18"/>
         </w:rPr>
-        <w:t xml:space="preserve">Build the seams now, not the features: this needs to grow toward 50–100 worlds and several not-yet-built capabilities without a rebuild. Ask for the Engineering Considerations Catalog — it names the specific, cheap-now choices (data fields, a clean retrieval interface, a real voice pipeline) that keep that true.</w:t>
+        <w:t xml:space="preserve">The seams below aren’t optional extras — they’re what keeps Phase 1 from being a dead end. See “Where This Is Headed” above for the specifics.</w:t>
       </w:r>
     </w:p>
     <w:sectPr>

</xml_diff>

<commit_message>
Design Brief: reword Roadmap Context section, seam table, and constraints into engineer-precise requirement/rationale language; leave experience-description sections as-is
</commit_message>
<xml_diff>
--- a/Ministry/Technology/CiC_FrontEnd_Design_Brief_V1_0.docx
+++ b/Ministry/Technology/CiC_FrontEnd_Design_Brief_V1_0.docx
@@ -51,7 +51,7 @@
           <w:sz w:val="15"/>
           <w:szCs w:val="15"/>
         </w:rPr>
-        <w:t xml:space="preserve">July 2026 · Longer than a one-pager where the long view changes how Phase 1 should be built — the full Front-End Vision &amp; Phased Plan and Experience Vision have more texture if you want it</w:t>
+        <w:t xml:space="preserve">July 2026 · Extended beyond one page to include forward-compatibility requirements — see the Front-End Vision &amp; Phased Plan and Experience Vision documents for full detail</w:t>
       </w:r>
     </w:p>
     <w:p>
@@ -916,7 +916,7 @@
           <w:sz w:val="21"/>
           <w:szCs w:val="21"/>
         </w:rPr>
-        <w:t xml:space="preserve">Where This Is Headed (So You Don’t Build a Trap)</w:t>
+        <w:t xml:space="preserve">Roadmap Context — Forward-Compatibility Requirements</w:t>
       </w:r>
     </w:p>
     <w:p>
@@ -929,7 +929,7 @@
           <w:sz w:val="18"/>
           <w:szCs w:val="18"/>
         </w:rPr>
-        <w:t xml:space="preserve">Phase 1 launches five worlds. The project doesn’t stop there — and knowing the shape of what comes next should change a few structural choices now, even though none of the features below need to be built yet.</w:t>
+        <w:t xml:space="preserve">Phase 1 ships five worlds, but the implementation should not assume five is the ceiling. The roadmap below is out of scope for Phase 1 delivery; it is in scope for Phase 1 architecture — the data model and interfaces need to accommodate it without requiring a breaking change or rebuild when it arrives.</w:t>
       </w:r>
     </w:p>
     <w:p>
@@ -981,7 +981,7 @@
           <w:sz w:val="18"/>
           <w:szCs w:val="18"/>
         </w:rPr>
-        <w:t xml:space="preserve">None of this is Phase 1 scope. All of it is Phase 1 architecture. The difference between a seam and a feature is that a seam costs almost nothing to leave in now and a lot to add back later — that’s the whole list below.</w:t>
+        <w:t xml:space="preserve">The table below translates the roadmap items above into concrete implementation requirements: each is a low-cost extension point if designed in at Phase 1, and a breaking change or partial rebuild if deferred.</w:t>
       </w:r>
     </w:p>
     <w:tbl>
@@ -1031,7 +1031,7 @@
                 <w:sz w:val="16"/>
                 <w:szCs w:val="16"/>
               </w:rPr>
-              <w:t xml:space="preserve">Build this seam now (cheap)</w:t>
+              <w:t xml:space="preserve">Requirement (Phase 1)</w:t>
             </w:r>
           </w:p>
         </w:tc>
@@ -1062,7 +1062,7 @@
                 <w:sz w:val="16"/>
                 <w:szCs w:val="16"/>
               </w:rPr>
-              <w:t xml:space="preserve">Because this needs it eventually (expensive to retrofit)</w:t>
+              <w:t xml:space="preserve">Forward-Compatibility Rationale</w:t>
             </w:r>
           </w:p>
         </w:tc>
@@ -1095,7 +1095,7 @@
                 <w:sz w:val="16"/>
                 <w:szCs w:val="16"/>
               </w:rPr>
-              <w:t xml:space="preserve">World data fields (temporal range, region, “shaped-by” relationships) on every world record, even unused</w:t>
+              <w:t xml:space="preserve">Include temporal range, region, and inter-world relationship fields in the world data schema, even if unused by Phase 1 UI.</w:t>
             </w:r>
           </w:p>
         </w:tc>
@@ -1126,7 +1126,7 @@
                 <w:sz w:val="16"/>
                 <w:szCs w:val="16"/>
               </w:rPr>
-              <w:t xml:space="preserve">So the future World Map is a visualization layer over data that already exists, not a data-collection project across every already-live world.</w:t>
+              <w:t xml:space="preserve">Avoids a data-migration effort across every deployed world when the World Map (timeline visualization) is implemented; the schema already supports it.</w:t>
             </w:r>
           </w:p>
         </w:tc>
@@ -1159,7 +1159,7 @@
                 <w:sz w:val="16"/>
                 <w:szCs w:val="16"/>
               </w:rPr>
-              <w:t xml:space="preserve">Retrieval called through one clean interface, not hardwired rule-matching everywhere it’s used</w:t>
+              <w:t xml:space="preserve">Implement retrieval behind a single interface. Do not inline rule-matching logic at each call site.</w:t>
             </w:r>
           </w:p>
         </w:tc>
@@ -1190,7 +1190,7 @@
                 <w:sz w:val="16"/>
                 <w:szCs w:val="16"/>
               </w:rPr>
-              <w:t xml:space="preserve">Swapping to smarter (semantic) search later becomes a single change behind that interface, not a rewrite of every place retrieval is called.</w:t>
+              <w:t xml:space="preserve">Permits the retrieval implementation to be swapped (e.g., rule-based to embedding-based) without modifying calling code.</w:t>
             </w:r>
           </w:p>
         </w:tc>
@@ -1223,7 +1223,7 @@
                 <w:sz w:val="16"/>
                 <w:szCs w:val="16"/>
               </w:rPr>
-              <w:t xml:space="preserve">The world-click UI built as a real four-option menu now, with three options visibly disabled</w:t>
+              <w:t xml:space="preserve">Implement world selection as a four-option menu (Description, Tour, Choose for Table, Academic Documents) with three options disabled, rather than a single-action UI.</w:t>
             </w:r>
           </w:p>
         </w:tc>
@@ -1254,7 +1254,7 @@
                 <w:sz w:val="16"/>
                 <w:szCs w:val="16"/>
               </w:rPr>
-              <w:t xml:space="preserve">Description, Tour, and Academic Documents activate later by turning a flag on, not by rebuilding the menu concept from scratch.</w:t>
+              <w:t xml:space="preserve">Later options are enabled via configuration/feature flag rather than requiring a UI redesign.</w:t>
             </w:r>
           </w:p>
         </w:tc>
@@ -1287,7 +1287,7 @@
                 <w:sz w:val="16"/>
                 <w:szCs w:val="16"/>
               </w:rPr>
-              <w:t xml:space="preserve">A role/entitlement field on sessions or users, even if nothing is gated yet</w:t>
+              <w:t xml:space="preserve">Include a role/entitlement field on the session or user model, even though no feature gating exists at Phase 1.</w:t>
             </w:r>
           </w:p>
         </w:tc>
@@ -1318,7 +1318,7 @@
                 <w:sz w:val="16"/>
                 <w:szCs w:val="16"/>
               </w:rPr>
-              <w:t xml:space="preserve">A future paid tier becomes a flag flip against an existing field, not a bolt-on identity system built under time pressure.</w:t>
+              <w:t xml:space="preserve">A future paid tier is implemented as a check against an existing field rather than requiring a new identity system added retroactively.</w:t>
             </w:r>
           </w:p>
         </w:tc>
@@ -1351,7 +1351,7 @@
                 <w:sz w:val="16"/>
                 <w:szCs w:val="16"/>
               </w:rPr>
-              <w:t xml:space="preserve">The real voice pipeline built now, pointed at a cheap voice</w:t>
+              <w:t xml:space="preserve">Implement the production voice pipeline now, configured with a low-cost voice model.</w:t>
             </w:r>
           </w:p>
         </w:tc>
@@ -1382,7 +1382,7 @@
                 <w:sz w:val="16"/>
                 <w:szCs w:val="16"/>
               </w:rPr>
-              <w:t xml:space="preserve">Richer, culturally-matched casting later is a configuration change — swap the voice model — not new plumbing.</w:t>
+              <w:t xml:space="preserve">Upgrading voice quality later is a configuration change (swap the model reference), not a new integration.</w:t>
             </w:r>
           </w:p>
         </w:tc>
@@ -1415,7 +1415,7 @@
                 <w:sz w:val="16"/>
                 <w:szCs w:val="16"/>
               </w:rPr>
-              <w:t xml:space="preserve">A version tag on each world’s content in the runtime session</w:t>
+              <w:t xml:space="preserve">Attach a content-version identifier to each world’s deployment package, tracked per session.</w:t>
             </w:r>
           </w:p>
         </w:tc>
@@ -1446,7 +1446,7 @@
                 <w:sz w:val="16"/>
                 <w:szCs w:val="16"/>
               </w:rPr>
-              <w:t xml:space="preserve">A world’s content can be revised after launch without a full app redeploy or breaking a conversation already in progress.</w:t>
+              <w:t xml:space="preserve">Enables content updates post-launch without a full application redeploy or disruption to an in-progress session.</w:t>
             </w:r>
           </w:p>
         </w:tc>
@@ -1479,7 +1479,7 @@
                 <w:sz w:val="16"/>
                 <w:szCs w:val="16"/>
               </w:rPr>
-              <w:t xml:space="preserve">One written, coherent policy on what conversation data is logged and why, before Alpha testing starts</w:t>
+              <w:t xml:space="preserve">Define and document a conversation-logging policy (what is logged, retention, access) before Alpha testing begins.</w:t>
             </w:r>
           </w:p>
         </w:tc>
@@ -1510,7 +1510,7 @@
                 <w:sz w:val="16"/>
                 <w:szCs w:val="16"/>
               </w:rPr>
-              <w:t xml:space="preserve">Internal quality review genuinely needs real conversation logs; that can’t be retrofitted honestly once people have already talked without knowing.</w:t>
+              <w:t xml:space="preserve">Internal QA requires real conversation data for review; participant disclosure cannot be applied retroactively once sessions have occurred.</w:t>
             </w:r>
           </w:p>
         </w:tc>
@@ -1529,7 +1529,7 @@
           <w:sz w:val="15"/>
           <w:szCs w:val="15"/>
         </w:rPr>
-        <w:t xml:space="preserve">Full detail behind each seam lives in Project-Reference/CiC_Engineering_Considerations_Catalog_V1_0.md — ask for it directly if you want the reasoning behind any one row.</w:t>
+        <w:t xml:space="preserve">Full technical rationale for each row is documented in Project-Reference/CiC_Engineering_Considerations_Catalog_V1_0.md — request it directly for the detailed reasoning behind any item.</w:t>
       </w:r>
     </w:p>
     <w:p>
@@ -1566,7 +1566,7 @@
           <w:sz w:val="18"/>
           <w:szCs w:val="18"/>
         </w:rPr>
-        <w:t xml:space="preserve">Hard ceiling: never more than five Representatives at once, full stop — worth designing for explicitly, not just assumed.</w:t>
+        <w:t xml:space="preserve">Concurrency limit: five Representatives is a fixed system constraint, not a current default — enforce it explicitly in session/state logic rather than relying on UI or prompt behavior to hold it.</w:t>
       </w:r>
     </w:p>
     <w:p>
@@ -1584,7 +1584,7 @@
           <w:sz w:val="18"/>
           <w:szCs w:val="18"/>
         </w:rPr>
-        <w:t xml:space="preserve">Text is permanently load-bearing: the hover/click transparency mechanic has no audio equivalent, so text can’t be designed away later even as voice matures.</w:t>
+        <w:t xml:space="preserve">Text is a permanent UI layer, not a fallback pending voice: the hover/click transparency mechanic has no audio equivalent, so text cannot be deprecated as voice output matures.</w:t>
       </w:r>
     </w:p>
     <w:p>
@@ -1602,7 +1602,7 @@
           <w:sz w:val="18"/>
           <w:szCs w:val="18"/>
         </w:rPr>
-        <w:t xml:space="preserve">The seams below aren’t optional extras — they’re what keeps Phase 1 from being a dead end. See “Where This Is Headed” above for the specifics.</w:t>
+        <w:t xml:space="preserve">The requirements above (Roadmap Context) are forward-compatibility constraints on the Phase 1 implementation, not optional scope — treat them as non-functional requirements alongside the functional spec.</w:t>
       </w:r>
     </w:p>
     <w:sectPr>

</xml_diff>

<commit_message>
Design Brief: reorder to context-first flow (Roadmap Context before near-term specifics); fix table row page-splitting
</commit_message>
<xml_diff>
--- a/Ministry/Technology/CiC_FrontEnd_Design_Brief_V1_0.docx
+++ b/Ministry/Technology/CiC_FrontEnd_Design_Brief_V1_0.docx
@@ -148,6 +148,659 @@
           <w:szCs w:val="18"/>
         </w:rPr>
         <w:t xml:space="preserve">Only what a world’s own evidence actually supports is shown, spoken, or offered — its vocabulary, the people depicted at its Table, the object in front of a Representative, the experiences it can offer. Where the evidence runs out, the system says so plainly. Nothing is invented to fill a gap — an honest absence is a finding, not a bug.</w:t>
+      </w:r>
+    </w:p>
+    <w:p>
+      <w:pPr>
+        <w:pBdr>
+          <w:bottom w:val="single" w:color="8FAADC" w:sz="4" w:space="2"/>
+        </w:pBdr>
+        <w:spacing w:after="60" w:before="160"/>
+      </w:pPr>
+      <w:r>
+        <w:rPr>
+          <w:rFonts w:ascii="Arial" w:cs="Arial" w:eastAsia="Arial" w:hAnsi="Arial"/>
+          <w:b/>
+          <w:bCs/>
+          <w:color w:val="1F3864"/>
+          <w:sz w:val="21"/>
+          <w:szCs w:val="21"/>
+        </w:rPr>
+        <w:t xml:space="preserve">Roadmap Context — Forward-Compatibility Requirements</w:t>
+      </w:r>
+    </w:p>
+    <w:p>
+      <w:pPr>
+        <w:spacing w:after="100" w:line="250"/>
+      </w:pPr>
+      <w:r>
+        <w:rPr>
+          <w:rFonts w:ascii="Arial" w:cs="Arial" w:eastAsia="Arial" w:hAnsi="Arial"/>
+          <w:sz w:val="18"/>
+          <w:szCs w:val="18"/>
+        </w:rPr>
+        <w:t xml:space="preserve">Phase 1 ships five worlds, but the implementation should not assume five is the ceiling. The roadmap below is out of scope for Phase 1 delivery; it is in scope for Phase 1 architecture — the data model and interfaces need to accommodate it without requiring a breaking change or rebuild when it arrives.</w:t>
+      </w:r>
+    </w:p>
+    <w:p>
+      <w:pPr>
+        <w:spacing w:after="100" w:line="250"/>
+      </w:pPr>
+      <w:r>
+        <w:rPr>
+          <w:rFonts w:ascii="Arial" w:cs="Arial" w:eastAsia="Arial" w:hAnsi="Arial"/>
+          <w:sz w:val="18"/>
+          <w:szCs w:val="18"/>
+        </w:rPr>
+        <w:t xml:space="preserve">The catalog eventually grows to 50–100 worlds spanning all of history and today, not just the Ancient Church set. Worlds stop being a flat list and become a real timeline — in the spirit of a Bible-timeline chart, not a literal map — positioned at their real historical moment, with contemporaries visible in parallel lanes and lines drawn between worlds that shaped each other. Worlds can be pulled to the same Table across eras, not just within one period.</w:t>
+      </w:r>
+    </w:p>
+    <w:p>
+      <w:pPr>
+        <w:spacing w:after="100" w:line="250"/>
+      </w:pPr>
+      <w:r>
+        <w:rPr>
+          <w:rFonts w:ascii="Arial" w:cs="Arial" w:eastAsia="Arial" w:hAnsi="Arial"/>
+          <w:sz w:val="18"/>
+          <w:szCs w:val="18"/>
+        </w:rPr>
+        <w:t xml:space="preserve">Clicking into a world eventually opens four choices, not one: Description, Tour, Choose for Table, and Academic Documents. Only Choose for Table is real at Phase 1. Academic Documents is a future standalone feature — raw, unmodified browsing of a world’s full lexicon, story repository, and source documents, independent of any conversation, distinct from the in-conversation hover/click (which stays free for everyone, permanently — a constitutional guarantee, never gated). Tours is a Representative guiding a participant through pictures of their world, potentially a church service or the Eucharist, bounded by the same evidence rule as everything else. Today’s "first pass" voice matures into fully culturally- and gender-matched, multilingual text-to-speech as funding allows.</w:t>
+      </w:r>
+    </w:p>
+    <w:p>
+      <w:pPr>
+        <w:spacing w:after="100" w:line="250"/>
+      </w:pPr>
+      <w:r>
+        <w:rPr>
+          <w:rFonts w:ascii="Arial" w:cs="Arial" w:eastAsia="Arial" w:hAnsi="Arial"/>
+          <w:sz w:val="18"/>
+          <w:szCs w:val="18"/>
+        </w:rPr>
+        <w:t xml:space="preserve">On funding: the core conversation stays free for everyone, donor-funded, permanently — that’s a constitutional guarantee, not a pricing choice that might change. A future paid tier may eventually unlock deeper pastor and academic tooling (Tours, sermon-prep material, Academic Documents) on top of that free core. That means some notion of user identity or entitlement is worth existing early, even completely unused at Phase 1.</w:t>
+      </w:r>
+    </w:p>
+    <w:p>
+      <w:pPr>
+        <w:spacing w:after="100" w:line="250"/>
+      </w:pPr>
+      <w:r>
+        <w:rPr>
+          <w:rFonts w:ascii="Arial" w:cs="Arial" w:eastAsia="Arial" w:hAnsi="Arial"/>
+          <w:sz w:val="18"/>
+          <w:szCs w:val="18"/>
+        </w:rPr>
+        <w:t xml:space="preserve">The table below translates the roadmap items above into concrete implementation requirements: each is a low-cost extension point if designed in at Phase 1, and a breaking change or partial rebuild if deferred.</w:t>
+      </w:r>
+    </w:p>
+    <w:tbl>
+      <w:tblPr>
+        <w:tblW w:type="dxa" w:w="9360"/>
+        <w:tblBorders>
+          <w:top w:val="single" w:color="auto" w:sz="4"/>
+          <w:left w:val="single" w:color="auto" w:sz="4"/>
+          <w:bottom w:val="single" w:color="auto" w:sz="4"/>
+          <w:right w:val="single" w:color="auto" w:sz="4"/>
+          <w:insideH w:val="single" w:color="auto" w:sz="4"/>
+          <w:insideV w:val="single" w:color="auto" w:sz="4"/>
+        </w:tblBorders>
+      </w:tblPr>
+      <w:tblGrid>
+        <w:gridCol w:w="4680"/>
+        <w:gridCol w:w="4680"/>
+      </w:tblGrid>
+      <w:tr>
+        <w:trPr>
+          <w:tblHeader/>
+        </w:trPr>
+        <w:tc>
+          <w:tcPr>
+            <w:tcW w:type="dxa" w:w="4680"/>
+            <w:tcBorders>
+              <w:top w:val="single" w:color="CCCCCC" w:sz="1"/>
+              <w:left w:val="single" w:color="CCCCCC" w:sz="1"/>
+              <w:bottom w:val="single" w:color="CCCCCC" w:sz="1"/>
+              <w:right w:val="single" w:color="CCCCCC" w:sz="1"/>
+            </w:tcBorders>
+            <w:shd w:fill="1F3864" w:val="clear"/>
+            <w:tcMar>
+              <w:top w:type="dxa" w:w="60"/>
+              <w:left w:type="dxa" w:w="100"/>
+              <w:bottom w:type="dxa" w:w="60"/>
+              <w:right w:type="dxa" w:w="100"/>
+            </w:tcMar>
+          </w:tcPr>
+          <w:p>
+            <w:r>
+              <w:rPr>
+                <w:rFonts w:ascii="Arial" w:cs="Arial" w:eastAsia="Arial" w:hAnsi="Arial"/>
+                <w:b/>
+                <w:bCs/>
+                <w:color w:val="FFFFFF"/>
+                <w:sz w:val="16"/>
+                <w:szCs w:val="16"/>
+              </w:rPr>
+              <w:t xml:space="preserve">Requirement (Phase 1)</w:t>
+            </w:r>
+          </w:p>
+        </w:tc>
+        <w:tc>
+          <w:tcPr>
+            <w:tcW w:type="dxa" w:w="4680"/>
+            <w:tcBorders>
+              <w:top w:val="single" w:color="CCCCCC" w:sz="1"/>
+              <w:left w:val="single" w:color="CCCCCC" w:sz="1"/>
+              <w:bottom w:val="single" w:color="CCCCCC" w:sz="1"/>
+              <w:right w:val="single" w:color="CCCCCC" w:sz="1"/>
+            </w:tcBorders>
+            <w:shd w:fill="1F3864" w:val="clear"/>
+            <w:tcMar>
+              <w:top w:type="dxa" w:w="60"/>
+              <w:left w:type="dxa" w:w="100"/>
+              <w:bottom w:type="dxa" w:w="60"/>
+              <w:right w:type="dxa" w:w="100"/>
+            </w:tcMar>
+          </w:tcPr>
+          <w:p>
+            <w:r>
+              <w:rPr>
+                <w:rFonts w:ascii="Arial" w:cs="Arial" w:eastAsia="Arial" w:hAnsi="Arial"/>
+                <w:b/>
+                <w:bCs/>
+                <w:color w:val="FFFFFF"/>
+                <w:sz w:val="16"/>
+                <w:szCs w:val="16"/>
+              </w:rPr>
+              <w:t xml:space="preserve">Forward-Compatibility Rationale</w:t>
+            </w:r>
+          </w:p>
+        </w:tc>
+      </w:tr>
+      <w:tr>
+        <w:trPr>
+          <w:cantSplit/>
+        </w:trPr>
+        <w:tc>
+          <w:tcPr>
+            <w:tcW w:type="dxa" w:w="4680"/>
+            <w:tcBorders>
+              <w:top w:val="single" w:color="CCCCCC" w:sz="1"/>
+              <w:left w:val="single" w:color="CCCCCC" w:sz="1"/>
+              <w:bottom w:val="single" w:color="CCCCCC" w:sz="1"/>
+              <w:right w:val="single" w:color="CCCCCC" w:sz="1"/>
+            </w:tcBorders>
+            <w:shd w:fill="F2F2F2" w:val="clear"/>
+            <w:tcMar>
+              <w:top w:type="dxa" w:w="60"/>
+              <w:left w:type="dxa" w:w="100"/>
+              <w:bottom w:type="dxa" w:w="60"/>
+              <w:right w:type="dxa" w:w="100"/>
+            </w:tcMar>
+          </w:tcPr>
+          <w:p>
+            <w:pPr>
+              <w:spacing w:line="230"/>
+            </w:pPr>
+            <w:r>
+              <w:rPr>
+                <w:rFonts w:ascii="Arial" w:cs="Arial" w:eastAsia="Arial" w:hAnsi="Arial"/>
+                <w:sz w:val="16"/>
+                <w:szCs w:val="16"/>
+              </w:rPr>
+              <w:t xml:space="preserve">Include temporal range, region, and inter-world relationship fields in the world data schema, even if unused by Phase 1 UI.</w:t>
+            </w:r>
+          </w:p>
+        </w:tc>
+        <w:tc>
+          <w:tcPr>
+            <w:tcW w:type="dxa" w:w="4680"/>
+            <w:tcBorders>
+              <w:top w:val="single" w:color="CCCCCC" w:sz="1"/>
+              <w:left w:val="single" w:color="CCCCCC" w:sz="1"/>
+              <w:bottom w:val="single" w:color="CCCCCC" w:sz="1"/>
+              <w:right w:val="single" w:color="CCCCCC" w:sz="1"/>
+            </w:tcBorders>
+            <w:shd w:fill="F2F2F2" w:val="clear"/>
+            <w:tcMar>
+              <w:top w:type="dxa" w:w="60"/>
+              <w:left w:type="dxa" w:w="100"/>
+              <w:bottom w:type="dxa" w:w="60"/>
+              <w:right w:type="dxa" w:w="100"/>
+            </w:tcMar>
+          </w:tcPr>
+          <w:p>
+            <w:pPr>
+              <w:spacing w:line="230"/>
+            </w:pPr>
+            <w:r>
+              <w:rPr>
+                <w:rFonts w:ascii="Arial" w:cs="Arial" w:eastAsia="Arial" w:hAnsi="Arial"/>
+                <w:sz w:val="16"/>
+                <w:szCs w:val="16"/>
+              </w:rPr>
+              <w:t xml:space="preserve">Avoids a data-migration effort across every deployed world when the World Map (timeline visualization) is implemented; the schema already supports it.</w:t>
+            </w:r>
+          </w:p>
+        </w:tc>
+      </w:tr>
+      <w:tr>
+        <w:trPr>
+          <w:cantSplit/>
+        </w:trPr>
+        <w:tc>
+          <w:tcPr>
+            <w:tcW w:type="dxa" w:w="4680"/>
+            <w:tcBorders>
+              <w:top w:val="single" w:color="CCCCCC" w:sz="1"/>
+              <w:left w:val="single" w:color="CCCCCC" w:sz="1"/>
+              <w:bottom w:val="single" w:color="CCCCCC" w:sz="1"/>
+              <w:right w:val="single" w:color="CCCCCC" w:sz="1"/>
+            </w:tcBorders>
+            <w:shd w:fill="FFFFFF" w:val="clear"/>
+            <w:tcMar>
+              <w:top w:type="dxa" w:w="60"/>
+              <w:left w:type="dxa" w:w="100"/>
+              <w:bottom w:type="dxa" w:w="60"/>
+              <w:right w:type="dxa" w:w="100"/>
+            </w:tcMar>
+          </w:tcPr>
+          <w:p>
+            <w:pPr>
+              <w:spacing w:line="230"/>
+            </w:pPr>
+            <w:r>
+              <w:rPr>
+                <w:rFonts w:ascii="Arial" w:cs="Arial" w:eastAsia="Arial" w:hAnsi="Arial"/>
+                <w:sz w:val="16"/>
+                <w:szCs w:val="16"/>
+              </w:rPr>
+              <w:t xml:space="preserve">Implement retrieval behind a single interface. Do not inline rule-matching logic at each call site.</w:t>
+            </w:r>
+          </w:p>
+        </w:tc>
+        <w:tc>
+          <w:tcPr>
+            <w:tcW w:type="dxa" w:w="4680"/>
+            <w:tcBorders>
+              <w:top w:val="single" w:color="CCCCCC" w:sz="1"/>
+              <w:left w:val="single" w:color="CCCCCC" w:sz="1"/>
+              <w:bottom w:val="single" w:color="CCCCCC" w:sz="1"/>
+              <w:right w:val="single" w:color="CCCCCC" w:sz="1"/>
+            </w:tcBorders>
+            <w:shd w:fill="FFFFFF" w:val="clear"/>
+            <w:tcMar>
+              <w:top w:type="dxa" w:w="60"/>
+              <w:left w:type="dxa" w:w="100"/>
+              <w:bottom w:type="dxa" w:w="60"/>
+              <w:right w:type="dxa" w:w="100"/>
+            </w:tcMar>
+          </w:tcPr>
+          <w:p>
+            <w:pPr>
+              <w:spacing w:line="230"/>
+            </w:pPr>
+            <w:r>
+              <w:rPr>
+                <w:rFonts w:ascii="Arial" w:cs="Arial" w:eastAsia="Arial" w:hAnsi="Arial"/>
+                <w:sz w:val="16"/>
+                <w:szCs w:val="16"/>
+              </w:rPr>
+              <w:t xml:space="preserve">Permits the retrieval implementation to be swapped (e.g., rule-based to embedding-based) without modifying calling code.</w:t>
+            </w:r>
+          </w:p>
+        </w:tc>
+      </w:tr>
+      <w:tr>
+        <w:trPr>
+          <w:cantSplit/>
+        </w:trPr>
+        <w:tc>
+          <w:tcPr>
+            <w:tcW w:type="dxa" w:w="4680"/>
+            <w:tcBorders>
+              <w:top w:val="single" w:color="CCCCCC" w:sz="1"/>
+              <w:left w:val="single" w:color="CCCCCC" w:sz="1"/>
+              <w:bottom w:val="single" w:color="CCCCCC" w:sz="1"/>
+              <w:right w:val="single" w:color="CCCCCC" w:sz="1"/>
+            </w:tcBorders>
+            <w:shd w:fill="F2F2F2" w:val="clear"/>
+            <w:tcMar>
+              <w:top w:type="dxa" w:w="60"/>
+              <w:left w:type="dxa" w:w="100"/>
+              <w:bottom w:type="dxa" w:w="60"/>
+              <w:right w:type="dxa" w:w="100"/>
+            </w:tcMar>
+          </w:tcPr>
+          <w:p>
+            <w:pPr>
+              <w:spacing w:line="230"/>
+            </w:pPr>
+            <w:r>
+              <w:rPr>
+                <w:rFonts w:ascii="Arial" w:cs="Arial" w:eastAsia="Arial" w:hAnsi="Arial"/>
+                <w:sz w:val="16"/>
+                <w:szCs w:val="16"/>
+              </w:rPr>
+              <w:t xml:space="preserve">Implement world selection as a four-option menu (Description, Tour, Choose for Table, Academic Documents) with three options disabled, rather than a single-action UI.</w:t>
+            </w:r>
+          </w:p>
+        </w:tc>
+        <w:tc>
+          <w:tcPr>
+            <w:tcW w:type="dxa" w:w="4680"/>
+            <w:tcBorders>
+              <w:top w:val="single" w:color="CCCCCC" w:sz="1"/>
+              <w:left w:val="single" w:color="CCCCCC" w:sz="1"/>
+              <w:bottom w:val="single" w:color="CCCCCC" w:sz="1"/>
+              <w:right w:val="single" w:color="CCCCCC" w:sz="1"/>
+            </w:tcBorders>
+            <w:shd w:fill="F2F2F2" w:val="clear"/>
+            <w:tcMar>
+              <w:top w:type="dxa" w:w="60"/>
+              <w:left w:type="dxa" w:w="100"/>
+              <w:bottom w:type="dxa" w:w="60"/>
+              <w:right w:type="dxa" w:w="100"/>
+            </w:tcMar>
+          </w:tcPr>
+          <w:p>
+            <w:pPr>
+              <w:spacing w:line="230"/>
+            </w:pPr>
+            <w:r>
+              <w:rPr>
+                <w:rFonts w:ascii="Arial" w:cs="Arial" w:eastAsia="Arial" w:hAnsi="Arial"/>
+                <w:sz w:val="16"/>
+                <w:szCs w:val="16"/>
+              </w:rPr>
+              <w:t xml:space="preserve">Later options are enabled via configuration/feature flag rather than requiring a UI redesign.</w:t>
+            </w:r>
+          </w:p>
+        </w:tc>
+      </w:tr>
+      <w:tr>
+        <w:trPr>
+          <w:cantSplit/>
+        </w:trPr>
+        <w:tc>
+          <w:tcPr>
+            <w:tcW w:type="dxa" w:w="4680"/>
+            <w:tcBorders>
+              <w:top w:val="single" w:color="CCCCCC" w:sz="1"/>
+              <w:left w:val="single" w:color="CCCCCC" w:sz="1"/>
+              <w:bottom w:val="single" w:color="CCCCCC" w:sz="1"/>
+              <w:right w:val="single" w:color="CCCCCC" w:sz="1"/>
+            </w:tcBorders>
+            <w:shd w:fill="FFFFFF" w:val="clear"/>
+            <w:tcMar>
+              <w:top w:type="dxa" w:w="60"/>
+              <w:left w:type="dxa" w:w="100"/>
+              <w:bottom w:type="dxa" w:w="60"/>
+              <w:right w:type="dxa" w:w="100"/>
+            </w:tcMar>
+          </w:tcPr>
+          <w:p>
+            <w:pPr>
+              <w:spacing w:line="230"/>
+            </w:pPr>
+            <w:r>
+              <w:rPr>
+                <w:rFonts w:ascii="Arial" w:cs="Arial" w:eastAsia="Arial" w:hAnsi="Arial"/>
+                <w:sz w:val="16"/>
+                <w:szCs w:val="16"/>
+              </w:rPr>
+              <w:t xml:space="preserve">Include a role/entitlement field on the session or user model, even though no feature gating exists at Phase 1.</w:t>
+            </w:r>
+          </w:p>
+        </w:tc>
+        <w:tc>
+          <w:tcPr>
+            <w:tcW w:type="dxa" w:w="4680"/>
+            <w:tcBorders>
+              <w:top w:val="single" w:color="CCCCCC" w:sz="1"/>
+              <w:left w:val="single" w:color="CCCCCC" w:sz="1"/>
+              <w:bottom w:val="single" w:color="CCCCCC" w:sz="1"/>
+              <w:right w:val="single" w:color="CCCCCC" w:sz="1"/>
+            </w:tcBorders>
+            <w:shd w:fill="FFFFFF" w:val="clear"/>
+            <w:tcMar>
+              <w:top w:type="dxa" w:w="60"/>
+              <w:left w:type="dxa" w:w="100"/>
+              <w:bottom w:type="dxa" w:w="60"/>
+              <w:right w:type="dxa" w:w="100"/>
+            </w:tcMar>
+          </w:tcPr>
+          <w:p>
+            <w:pPr>
+              <w:spacing w:line="230"/>
+            </w:pPr>
+            <w:r>
+              <w:rPr>
+                <w:rFonts w:ascii="Arial" w:cs="Arial" w:eastAsia="Arial" w:hAnsi="Arial"/>
+                <w:sz w:val="16"/>
+                <w:szCs w:val="16"/>
+              </w:rPr>
+              <w:t xml:space="preserve">A future paid tier is implemented as a check against an existing field rather than requiring a new identity system added retroactively.</w:t>
+            </w:r>
+          </w:p>
+        </w:tc>
+      </w:tr>
+      <w:tr>
+        <w:trPr>
+          <w:cantSplit/>
+        </w:trPr>
+        <w:tc>
+          <w:tcPr>
+            <w:tcW w:type="dxa" w:w="4680"/>
+            <w:tcBorders>
+              <w:top w:val="single" w:color="CCCCCC" w:sz="1"/>
+              <w:left w:val="single" w:color="CCCCCC" w:sz="1"/>
+              <w:bottom w:val="single" w:color="CCCCCC" w:sz="1"/>
+              <w:right w:val="single" w:color="CCCCCC" w:sz="1"/>
+            </w:tcBorders>
+            <w:shd w:fill="F2F2F2" w:val="clear"/>
+            <w:tcMar>
+              <w:top w:type="dxa" w:w="60"/>
+              <w:left w:type="dxa" w:w="100"/>
+              <w:bottom w:type="dxa" w:w="60"/>
+              <w:right w:type="dxa" w:w="100"/>
+            </w:tcMar>
+          </w:tcPr>
+          <w:p>
+            <w:pPr>
+              <w:spacing w:line="230"/>
+            </w:pPr>
+            <w:r>
+              <w:rPr>
+                <w:rFonts w:ascii="Arial" w:cs="Arial" w:eastAsia="Arial" w:hAnsi="Arial"/>
+                <w:sz w:val="16"/>
+                <w:szCs w:val="16"/>
+              </w:rPr>
+              <w:t xml:space="preserve">Implement the production voice pipeline now, configured with a low-cost voice model.</w:t>
+            </w:r>
+          </w:p>
+        </w:tc>
+        <w:tc>
+          <w:tcPr>
+            <w:tcW w:type="dxa" w:w="4680"/>
+            <w:tcBorders>
+              <w:top w:val="single" w:color="CCCCCC" w:sz="1"/>
+              <w:left w:val="single" w:color="CCCCCC" w:sz="1"/>
+              <w:bottom w:val="single" w:color="CCCCCC" w:sz="1"/>
+              <w:right w:val="single" w:color="CCCCCC" w:sz="1"/>
+            </w:tcBorders>
+            <w:shd w:fill="F2F2F2" w:val="clear"/>
+            <w:tcMar>
+              <w:top w:type="dxa" w:w="60"/>
+              <w:left w:type="dxa" w:w="100"/>
+              <w:bottom w:type="dxa" w:w="60"/>
+              <w:right w:type="dxa" w:w="100"/>
+            </w:tcMar>
+          </w:tcPr>
+          <w:p>
+            <w:pPr>
+              <w:spacing w:line="230"/>
+            </w:pPr>
+            <w:r>
+              <w:rPr>
+                <w:rFonts w:ascii="Arial" w:cs="Arial" w:eastAsia="Arial" w:hAnsi="Arial"/>
+                <w:sz w:val="16"/>
+                <w:szCs w:val="16"/>
+              </w:rPr>
+              <w:t xml:space="preserve">Upgrading voice quality later is a configuration change (swap the model reference), not a new integration.</w:t>
+            </w:r>
+          </w:p>
+        </w:tc>
+      </w:tr>
+      <w:tr>
+        <w:trPr>
+          <w:cantSplit/>
+        </w:trPr>
+        <w:tc>
+          <w:tcPr>
+            <w:tcW w:type="dxa" w:w="4680"/>
+            <w:tcBorders>
+              <w:top w:val="single" w:color="CCCCCC" w:sz="1"/>
+              <w:left w:val="single" w:color="CCCCCC" w:sz="1"/>
+              <w:bottom w:val="single" w:color="CCCCCC" w:sz="1"/>
+              <w:right w:val="single" w:color="CCCCCC" w:sz="1"/>
+            </w:tcBorders>
+            <w:shd w:fill="FFFFFF" w:val="clear"/>
+            <w:tcMar>
+              <w:top w:type="dxa" w:w="60"/>
+              <w:left w:type="dxa" w:w="100"/>
+              <w:bottom w:type="dxa" w:w="60"/>
+              <w:right w:type="dxa" w:w="100"/>
+            </w:tcMar>
+          </w:tcPr>
+          <w:p>
+            <w:pPr>
+              <w:spacing w:line="230"/>
+            </w:pPr>
+            <w:r>
+              <w:rPr>
+                <w:rFonts w:ascii="Arial" w:cs="Arial" w:eastAsia="Arial" w:hAnsi="Arial"/>
+                <w:sz w:val="16"/>
+                <w:szCs w:val="16"/>
+              </w:rPr>
+              <w:t xml:space="preserve">Attach a content-version identifier to each world’s deployment package, tracked per session.</w:t>
+            </w:r>
+          </w:p>
+        </w:tc>
+        <w:tc>
+          <w:tcPr>
+            <w:tcW w:type="dxa" w:w="4680"/>
+            <w:tcBorders>
+              <w:top w:val="single" w:color="CCCCCC" w:sz="1"/>
+              <w:left w:val="single" w:color="CCCCCC" w:sz="1"/>
+              <w:bottom w:val="single" w:color="CCCCCC" w:sz="1"/>
+              <w:right w:val="single" w:color="CCCCCC" w:sz="1"/>
+            </w:tcBorders>
+            <w:shd w:fill="FFFFFF" w:val="clear"/>
+            <w:tcMar>
+              <w:top w:type="dxa" w:w="60"/>
+              <w:left w:type="dxa" w:w="100"/>
+              <w:bottom w:type="dxa" w:w="60"/>
+              <w:right w:type="dxa" w:w="100"/>
+            </w:tcMar>
+          </w:tcPr>
+          <w:p>
+            <w:pPr>
+              <w:spacing w:line="230"/>
+            </w:pPr>
+            <w:r>
+              <w:rPr>
+                <w:rFonts w:ascii="Arial" w:cs="Arial" w:eastAsia="Arial" w:hAnsi="Arial"/>
+                <w:sz w:val="16"/>
+                <w:szCs w:val="16"/>
+              </w:rPr>
+              <w:t xml:space="preserve">Enables content updates post-launch without a full application redeploy or disruption to an in-progress session.</w:t>
+            </w:r>
+          </w:p>
+        </w:tc>
+      </w:tr>
+      <w:tr>
+        <w:trPr>
+          <w:cantSplit/>
+        </w:trPr>
+        <w:tc>
+          <w:tcPr>
+            <w:tcW w:type="dxa" w:w="4680"/>
+            <w:tcBorders>
+              <w:top w:val="single" w:color="CCCCCC" w:sz="1"/>
+              <w:left w:val="single" w:color="CCCCCC" w:sz="1"/>
+              <w:bottom w:val="single" w:color="CCCCCC" w:sz="1"/>
+              <w:right w:val="single" w:color="CCCCCC" w:sz="1"/>
+            </w:tcBorders>
+            <w:shd w:fill="F2F2F2" w:val="clear"/>
+            <w:tcMar>
+              <w:top w:type="dxa" w:w="60"/>
+              <w:left w:type="dxa" w:w="100"/>
+              <w:bottom w:type="dxa" w:w="60"/>
+              <w:right w:type="dxa" w:w="100"/>
+            </w:tcMar>
+          </w:tcPr>
+          <w:p>
+            <w:pPr>
+              <w:spacing w:line="230"/>
+            </w:pPr>
+            <w:r>
+              <w:rPr>
+                <w:rFonts w:ascii="Arial" w:cs="Arial" w:eastAsia="Arial" w:hAnsi="Arial"/>
+                <w:sz w:val="16"/>
+                <w:szCs w:val="16"/>
+              </w:rPr>
+              <w:t xml:space="preserve">Define and document a conversation-logging policy (what is logged, retention, access) before Alpha testing begins.</w:t>
+            </w:r>
+          </w:p>
+        </w:tc>
+        <w:tc>
+          <w:tcPr>
+            <w:tcW w:type="dxa" w:w="4680"/>
+            <w:tcBorders>
+              <w:top w:val="single" w:color="CCCCCC" w:sz="1"/>
+              <w:left w:val="single" w:color="CCCCCC" w:sz="1"/>
+              <w:bottom w:val="single" w:color="CCCCCC" w:sz="1"/>
+              <w:right w:val="single" w:color="CCCCCC" w:sz="1"/>
+            </w:tcBorders>
+            <w:shd w:fill="F2F2F2" w:val="clear"/>
+            <w:tcMar>
+              <w:top w:type="dxa" w:w="60"/>
+              <w:left w:type="dxa" w:w="100"/>
+              <w:bottom w:type="dxa" w:w="60"/>
+              <w:right w:type="dxa" w:w="100"/>
+            </w:tcMar>
+          </w:tcPr>
+          <w:p>
+            <w:pPr>
+              <w:spacing w:line="230"/>
+            </w:pPr>
+            <w:r>
+              <w:rPr>
+                <w:rFonts w:ascii="Arial" w:cs="Arial" w:eastAsia="Arial" w:hAnsi="Arial"/>
+                <w:sz w:val="16"/>
+                <w:szCs w:val="16"/>
+              </w:rPr>
+              <w:t xml:space="preserve">Internal QA requires real conversation data for review; participant disclosure cannot be applied retroactively once sessions have occurred.</w:t>
+            </w:r>
+          </w:p>
+        </w:tc>
+      </w:tr>
+    </w:tbl>
+    <w:p>
+      <w:pPr>
+        <w:spacing w:after="0" w:before="120" w:line="230"/>
+      </w:pPr>
+      <w:r>
+        <w:rPr>
+          <w:rFonts w:ascii="Arial" w:cs="Arial" w:eastAsia="Arial" w:hAnsi="Arial"/>
+          <w:i/>
+          <w:iCs/>
+          <w:color w:val="595959"/>
+          <w:sz w:val="15"/>
+          <w:szCs w:val="15"/>
+        </w:rPr>
+        <w:t xml:space="preserve">Full technical rationale for each row is documented in Project-Reference/CiC_Engineering_Considerations_Catalog_V1_0.md — request it directly for the detailed reasoning behind any item.</w:t>
       </w:r>
     </w:p>
     <w:p>
@@ -458,6 +1111,9 @@
         </w:tc>
       </w:tr>
       <w:tr>
+        <w:trPr>
+          <w:cantSplit/>
+        </w:trPr>
         <w:tc>
           <w:tcPr>
             <w:tcW w:type="dxa" w:w="2400"/>
@@ -600,6 +1256,9 @@
         </w:tc>
       </w:tr>
       <w:tr>
+        <w:trPr>
+          <w:cantSplit/>
+        </w:trPr>
         <w:tc>
           <w:tcPr>
             <w:tcW w:type="dxa" w:w="2400"/>
@@ -742,6 +1401,9 @@
         </w:tc>
       </w:tr>
       <w:tr>
+        <w:trPr>
+          <w:cantSplit/>
+        </w:trPr>
         <w:tc>
           <w:tcPr>
             <w:tcW w:type="dxa" w:w="2400"/>
@@ -898,638 +1560,6 @@
           <w:szCs w:val="15"/>
         </w:rPr>
         <w:t xml:space="preserve">Beyond Phase 1: richer multilingual voice casting and role-based emphasis layer in on an ongoing track as funding allows; the eventual Ultimate Vision adds a full world timeline spanning history, cross-era Tables, and guided "Tours" of a world’s worship life — bounded by the same evidentiary rule above.</w:t>
-      </w:r>
-    </w:p>
-    <w:p>
-      <w:pPr>
-        <w:pBdr>
-          <w:bottom w:val="single" w:color="8FAADC" w:sz="4" w:space="2"/>
-        </w:pBdr>
-        <w:spacing w:after="60" w:before="160"/>
-      </w:pPr>
-      <w:r>
-        <w:rPr>
-          <w:rFonts w:ascii="Arial" w:cs="Arial" w:eastAsia="Arial" w:hAnsi="Arial"/>
-          <w:b/>
-          <w:bCs/>
-          <w:color w:val="1F3864"/>
-          <w:sz w:val="21"/>
-          <w:szCs w:val="21"/>
-        </w:rPr>
-        <w:t xml:space="preserve">Roadmap Context — Forward-Compatibility Requirements</w:t>
-      </w:r>
-    </w:p>
-    <w:p>
-      <w:pPr>
-        <w:spacing w:after="100" w:line="250"/>
-      </w:pPr>
-      <w:r>
-        <w:rPr>
-          <w:rFonts w:ascii="Arial" w:cs="Arial" w:eastAsia="Arial" w:hAnsi="Arial"/>
-          <w:sz w:val="18"/>
-          <w:szCs w:val="18"/>
-        </w:rPr>
-        <w:t xml:space="preserve">Phase 1 ships five worlds, but the implementation should not assume five is the ceiling. The roadmap below is out of scope for Phase 1 delivery; it is in scope for Phase 1 architecture — the data model and interfaces need to accommodate it without requiring a breaking change or rebuild when it arrives.</w:t>
-      </w:r>
-    </w:p>
-    <w:p>
-      <w:pPr>
-        <w:spacing w:after="100" w:line="250"/>
-      </w:pPr>
-      <w:r>
-        <w:rPr>
-          <w:rFonts w:ascii="Arial" w:cs="Arial" w:eastAsia="Arial" w:hAnsi="Arial"/>
-          <w:sz w:val="18"/>
-          <w:szCs w:val="18"/>
-        </w:rPr>
-        <w:t xml:space="preserve">The catalog eventually grows to 50–100 worlds spanning all of history and today, not just the Ancient Church set. Worlds stop being a flat list and become a real timeline — in the spirit of a Bible-timeline chart, not a literal map — positioned at their real historical moment, with contemporaries visible in parallel lanes and lines drawn between worlds that shaped each other. Worlds can be pulled to the same Table across eras, not just within one period.</w:t>
-      </w:r>
-    </w:p>
-    <w:p>
-      <w:pPr>
-        <w:spacing w:after="100" w:line="250"/>
-      </w:pPr>
-      <w:r>
-        <w:rPr>
-          <w:rFonts w:ascii="Arial" w:cs="Arial" w:eastAsia="Arial" w:hAnsi="Arial"/>
-          <w:sz w:val="18"/>
-          <w:szCs w:val="18"/>
-        </w:rPr>
-        <w:t xml:space="preserve">Clicking into a world eventually opens four choices, not one: Description, Tour, Choose for Table, and Academic Documents. Only Choose for Table is real at Phase 1. Academic Documents is a future standalone feature — raw, unmodified browsing of a world’s full lexicon, story repository, and source documents, independent of any conversation, distinct from the in-conversation hover/click (which stays free for everyone, permanently — a constitutional guarantee, never gated). Tours is a Representative guiding a participant through pictures of their world, potentially a church service or the Eucharist, bounded by the same evidence rule as everything else. Today’s "first pass" voice matures into fully culturally- and gender-matched, multilingual text-to-speech as funding allows.</w:t>
-      </w:r>
-    </w:p>
-    <w:p>
-      <w:pPr>
-        <w:spacing w:after="100" w:line="250"/>
-      </w:pPr>
-      <w:r>
-        <w:rPr>
-          <w:rFonts w:ascii="Arial" w:cs="Arial" w:eastAsia="Arial" w:hAnsi="Arial"/>
-          <w:sz w:val="18"/>
-          <w:szCs w:val="18"/>
-        </w:rPr>
-        <w:t xml:space="preserve">On funding: the core conversation stays free for everyone, donor-funded, permanently — that’s a constitutional guarantee, not a pricing choice that might change. A future paid tier may eventually unlock deeper pastor and academic tooling (Tours, sermon-prep material, Academic Documents) on top of that free core. That means some notion of user identity or entitlement is worth existing early, even completely unused at Phase 1.</w:t>
-      </w:r>
-    </w:p>
-    <w:p>
-      <w:pPr>
-        <w:spacing w:after="100" w:line="250"/>
-      </w:pPr>
-      <w:r>
-        <w:rPr>
-          <w:rFonts w:ascii="Arial" w:cs="Arial" w:eastAsia="Arial" w:hAnsi="Arial"/>
-          <w:sz w:val="18"/>
-          <w:szCs w:val="18"/>
-        </w:rPr>
-        <w:t xml:space="preserve">The table below translates the roadmap items above into concrete implementation requirements: each is a low-cost extension point if designed in at Phase 1, and a breaking change or partial rebuild if deferred.</w:t>
-      </w:r>
-    </w:p>
-    <w:tbl>
-      <w:tblPr>
-        <w:tblW w:type="dxa" w:w="9360"/>
-        <w:tblBorders>
-          <w:top w:val="single" w:color="auto" w:sz="4"/>
-          <w:left w:val="single" w:color="auto" w:sz="4"/>
-          <w:bottom w:val="single" w:color="auto" w:sz="4"/>
-          <w:right w:val="single" w:color="auto" w:sz="4"/>
-          <w:insideH w:val="single" w:color="auto" w:sz="4"/>
-          <w:insideV w:val="single" w:color="auto" w:sz="4"/>
-        </w:tblBorders>
-      </w:tblPr>
-      <w:tblGrid>
-        <w:gridCol w:w="4680"/>
-        <w:gridCol w:w="4680"/>
-      </w:tblGrid>
-      <w:tr>
-        <w:trPr>
-          <w:tblHeader/>
-        </w:trPr>
-        <w:tc>
-          <w:tcPr>
-            <w:tcW w:type="dxa" w:w="4680"/>
-            <w:tcBorders>
-              <w:top w:val="single" w:color="CCCCCC" w:sz="1"/>
-              <w:left w:val="single" w:color="CCCCCC" w:sz="1"/>
-              <w:bottom w:val="single" w:color="CCCCCC" w:sz="1"/>
-              <w:right w:val="single" w:color="CCCCCC" w:sz="1"/>
-            </w:tcBorders>
-            <w:shd w:fill="1F3864" w:val="clear"/>
-            <w:tcMar>
-              <w:top w:type="dxa" w:w="60"/>
-              <w:left w:type="dxa" w:w="100"/>
-              <w:bottom w:type="dxa" w:w="60"/>
-              <w:right w:type="dxa" w:w="100"/>
-            </w:tcMar>
-          </w:tcPr>
-          <w:p>
-            <w:r>
-              <w:rPr>
-                <w:rFonts w:ascii="Arial" w:cs="Arial" w:eastAsia="Arial" w:hAnsi="Arial"/>
-                <w:b/>
-                <w:bCs/>
-                <w:color w:val="FFFFFF"/>
-                <w:sz w:val="16"/>
-                <w:szCs w:val="16"/>
-              </w:rPr>
-              <w:t xml:space="preserve">Requirement (Phase 1)</w:t>
-            </w:r>
-          </w:p>
-        </w:tc>
-        <w:tc>
-          <w:tcPr>
-            <w:tcW w:type="dxa" w:w="4680"/>
-            <w:tcBorders>
-              <w:top w:val="single" w:color="CCCCCC" w:sz="1"/>
-              <w:left w:val="single" w:color="CCCCCC" w:sz="1"/>
-              <w:bottom w:val="single" w:color="CCCCCC" w:sz="1"/>
-              <w:right w:val="single" w:color="CCCCCC" w:sz="1"/>
-            </w:tcBorders>
-            <w:shd w:fill="1F3864" w:val="clear"/>
-            <w:tcMar>
-              <w:top w:type="dxa" w:w="60"/>
-              <w:left w:type="dxa" w:w="100"/>
-              <w:bottom w:type="dxa" w:w="60"/>
-              <w:right w:type="dxa" w:w="100"/>
-            </w:tcMar>
-          </w:tcPr>
-          <w:p>
-            <w:r>
-              <w:rPr>
-                <w:rFonts w:ascii="Arial" w:cs="Arial" w:eastAsia="Arial" w:hAnsi="Arial"/>
-                <w:b/>
-                <w:bCs/>
-                <w:color w:val="FFFFFF"/>
-                <w:sz w:val="16"/>
-                <w:szCs w:val="16"/>
-              </w:rPr>
-              <w:t xml:space="preserve">Forward-Compatibility Rationale</w:t>
-            </w:r>
-          </w:p>
-        </w:tc>
-      </w:tr>
-      <w:tr>
-        <w:tc>
-          <w:tcPr>
-            <w:tcW w:type="dxa" w:w="4680"/>
-            <w:tcBorders>
-              <w:top w:val="single" w:color="CCCCCC" w:sz="1"/>
-              <w:left w:val="single" w:color="CCCCCC" w:sz="1"/>
-              <w:bottom w:val="single" w:color="CCCCCC" w:sz="1"/>
-              <w:right w:val="single" w:color="CCCCCC" w:sz="1"/>
-            </w:tcBorders>
-            <w:shd w:fill="F2F2F2" w:val="clear"/>
-            <w:tcMar>
-              <w:top w:type="dxa" w:w="60"/>
-              <w:left w:type="dxa" w:w="100"/>
-              <w:bottom w:type="dxa" w:w="60"/>
-              <w:right w:type="dxa" w:w="100"/>
-            </w:tcMar>
-          </w:tcPr>
-          <w:p>
-            <w:pPr>
-              <w:spacing w:line="230"/>
-            </w:pPr>
-            <w:r>
-              <w:rPr>
-                <w:rFonts w:ascii="Arial" w:cs="Arial" w:eastAsia="Arial" w:hAnsi="Arial"/>
-                <w:sz w:val="16"/>
-                <w:szCs w:val="16"/>
-              </w:rPr>
-              <w:t xml:space="preserve">Include temporal range, region, and inter-world relationship fields in the world data schema, even if unused by Phase 1 UI.</w:t>
-            </w:r>
-          </w:p>
-        </w:tc>
-        <w:tc>
-          <w:tcPr>
-            <w:tcW w:type="dxa" w:w="4680"/>
-            <w:tcBorders>
-              <w:top w:val="single" w:color="CCCCCC" w:sz="1"/>
-              <w:left w:val="single" w:color="CCCCCC" w:sz="1"/>
-              <w:bottom w:val="single" w:color="CCCCCC" w:sz="1"/>
-              <w:right w:val="single" w:color="CCCCCC" w:sz="1"/>
-            </w:tcBorders>
-            <w:shd w:fill="F2F2F2" w:val="clear"/>
-            <w:tcMar>
-              <w:top w:type="dxa" w:w="60"/>
-              <w:left w:type="dxa" w:w="100"/>
-              <w:bottom w:type="dxa" w:w="60"/>
-              <w:right w:type="dxa" w:w="100"/>
-            </w:tcMar>
-          </w:tcPr>
-          <w:p>
-            <w:pPr>
-              <w:spacing w:line="230"/>
-            </w:pPr>
-            <w:r>
-              <w:rPr>
-                <w:rFonts w:ascii="Arial" w:cs="Arial" w:eastAsia="Arial" w:hAnsi="Arial"/>
-                <w:sz w:val="16"/>
-                <w:szCs w:val="16"/>
-              </w:rPr>
-              <w:t xml:space="preserve">Avoids a data-migration effort across every deployed world when the World Map (timeline visualization) is implemented; the schema already supports it.</w:t>
-            </w:r>
-          </w:p>
-        </w:tc>
-      </w:tr>
-      <w:tr>
-        <w:tc>
-          <w:tcPr>
-            <w:tcW w:type="dxa" w:w="4680"/>
-            <w:tcBorders>
-              <w:top w:val="single" w:color="CCCCCC" w:sz="1"/>
-              <w:left w:val="single" w:color="CCCCCC" w:sz="1"/>
-              <w:bottom w:val="single" w:color="CCCCCC" w:sz="1"/>
-              <w:right w:val="single" w:color="CCCCCC" w:sz="1"/>
-            </w:tcBorders>
-            <w:shd w:fill="FFFFFF" w:val="clear"/>
-            <w:tcMar>
-              <w:top w:type="dxa" w:w="60"/>
-              <w:left w:type="dxa" w:w="100"/>
-              <w:bottom w:type="dxa" w:w="60"/>
-              <w:right w:type="dxa" w:w="100"/>
-            </w:tcMar>
-          </w:tcPr>
-          <w:p>
-            <w:pPr>
-              <w:spacing w:line="230"/>
-            </w:pPr>
-            <w:r>
-              <w:rPr>
-                <w:rFonts w:ascii="Arial" w:cs="Arial" w:eastAsia="Arial" w:hAnsi="Arial"/>
-                <w:sz w:val="16"/>
-                <w:szCs w:val="16"/>
-              </w:rPr>
-              <w:t xml:space="preserve">Implement retrieval behind a single interface. Do not inline rule-matching logic at each call site.</w:t>
-            </w:r>
-          </w:p>
-        </w:tc>
-        <w:tc>
-          <w:tcPr>
-            <w:tcW w:type="dxa" w:w="4680"/>
-            <w:tcBorders>
-              <w:top w:val="single" w:color="CCCCCC" w:sz="1"/>
-              <w:left w:val="single" w:color="CCCCCC" w:sz="1"/>
-              <w:bottom w:val="single" w:color="CCCCCC" w:sz="1"/>
-              <w:right w:val="single" w:color="CCCCCC" w:sz="1"/>
-            </w:tcBorders>
-            <w:shd w:fill="FFFFFF" w:val="clear"/>
-            <w:tcMar>
-              <w:top w:type="dxa" w:w="60"/>
-              <w:left w:type="dxa" w:w="100"/>
-              <w:bottom w:type="dxa" w:w="60"/>
-              <w:right w:type="dxa" w:w="100"/>
-            </w:tcMar>
-          </w:tcPr>
-          <w:p>
-            <w:pPr>
-              <w:spacing w:line="230"/>
-            </w:pPr>
-            <w:r>
-              <w:rPr>
-                <w:rFonts w:ascii="Arial" w:cs="Arial" w:eastAsia="Arial" w:hAnsi="Arial"/>
-                <w:sz w:val="16"/>
-                <w:szCs w:val="16"/>
-              </w:rPr>
-              <w:t xml:space="preserve">Permits the retrieval implementation to be swapped (e.g., rule-based to embedding-based) without modifying calling code.</w:t>
-            </w:r>
-          </w:p>
-        </w:tc>
-      </w:tr>
-      <w:tr>
-        <w:tc>
-          <w:tcPr>
-            <w:tcW w:type="dxa" w:w="4680"/>
-            <w:tcBorders>
-              <w:top w:val="single" w:color="CCCCCC" w:sz="1"/>
-              <w:left w:val="single" w:color="CCCCCC" w:sz="1"/>
-              <w:bottom w:val="single" w:color="CCCCCC" w:sz="1"/>
-              <w:right w:val="single" w:color="CCCCCC" w:sz="1"/>
-            </w:tcBorders>
-            <w:shd w:fill="F2F2F2" w:val="clear"/>
-            <w:tcMar>
-              <w:top w:type="dxa" w:w="60"/>
-              <w:left w:type="dxa" w:w="100"/>
-              <w:bottom w:type="dxa" w:w="60"/>
-              <w:right w:type="dxa" w:w="100"/>
-            </w:tcMar>
-          </w:tcPr>
-          <w:p>
-            <w:pPr>
-              <w:spacing w:line="230"/>
-            </w:pPr>
-            <w:r>
-              <w:rPr>
-                <w:rFonts w:ascii="Arial" w:cs="Arial" w:eastAsia="Arial" w:hAnsi="Arial"/>
-                <w:sz w:val="16"/>
-                <w:szCs w:val="16"/>
-              </w:rPr>
-              <w:t xml:space="preserve">Implement world selection as a four-option menu (Description, Tour, Choose for Table, Academic Documents) with three options disabled, rather than a single-action UI.</w:t>
-            </w:r>
-          </w:p>
-        </w:tc>
-        <w:tc>
-          <w:tcPr>
-            <w:tcW w:type="dxa" w:w="4680"/>
-            <w:tcBorders>
-              <w:top w:val="single" w:color="CCCCCC" w:sz="1"/>
-              <w:left w:val="single" w:color="CCCCCC" w:sz="1"/>
-              <w:bottom w:val="single" w:color="CCCCCC" w:sz="1"/>
-              <w:right w:val="single" w:color="CCCCCC" w:sz="1"/>
-            </w:tcBorders>
-            <w:shd w:fill="F2F2F2" w:val="clear"/>
-            <w:tcMar>
-              <w:top w:type="dxa" w:w="60"/>
-              <w:left w:type="dxa" w:w="100"/>
-              <w:bottom w:type="dxa" w:w="60"/>
-              <w:right w:type="dxa" w:w="100"/>
-            </w:tcMar>
-          </w:tcPr>
-          <w:p>
-            <w:pPr>
-              <w:spacing w:line="230"/>
-            </w:pPr>
-            <w:r>
-              <w:rPr>
-                <w:rFonts w:ascii="Arial" w:cs="Arial" w:eastAsia="Arial" w:hAnsi="Arial"/>
-                <w:sz w:val="16"/>
-                <w:szCs w:val="16"/>
-              </w:rPr>
-              <w:t xml:space="preserve">Later options are enabled via configuration/feature flag rather than requiring a UI redesign.</w:t>
-            </w:r>
-          </w:p>
-        </w:tc>
-      </w:tr>
-      <w:tr>
-        <w:tc>
-          <w:tcPr>
-            <w:tcW w:type="dxa" w:w="4680"/>
-            <w:tcBorders>
-              <w:top w:val="single" w:color="CCCCCC" w:sz="1"/>
-              <w:left w:val="single" w:color="CCCCCC" w:sz="1"/>
-              <w:bottom w:val="single" w:color="CCCCCC" w:sz="1"/>
-              <w:right w:val="single" w:color="CCCCCC" w:sz="1"/>
-            </w:tcBorders>
-            <w:shd w:fill="FFFFFF" w:val="clear"/>
-            <w:tcMar>
-              <w:top w:type="dxa" w:w="60"/>
-              <w:left w:type="dxa" w:w="100"/>
-              <w:bottom w:type="dxa" w:w="60"/>
-              <w:right w:type="dxa" w:w="100"/>
-            </w:tcMar>
-          </w:tcPr>
-          <w:p>
-            <w:pPr>
-              <w:spacing w:line="230"/>
-            </w:pPr>
-            <w:r>
-              <w:rPr>
-                <w:rFonts w:ascii="Arial" w:cs="Arial" w:eastAsia="Arial" w:hAnsi="Arial"/>
-                <w:sz w:val="16"/>
-                <w:szCs w:val="16"/>
-              </w:rPr>
-              <w:t xml:space="preserve">Include a role/entitlement field on the session or user model, even though no feature gating exists at Phase 1.</w:t>
-            </w:r>
-          </w:p>
-        </w:tc>
-        <w:tc>
-          <w:tcPr>
-            <w:tcW w:type="dxa" w:w="4680"/>
-            <w:tcBorders>
-              <w:top w:val="single" w:color="CCCCCC" w:sz="1"/>
-              <w:left w:val="single" w:color="CCCCCC" w:sz="1"/>
-              <w:bottom w:val="single" w:color="CCCCCC" w:sz="1"/>
-              <w:right w:val="single" w:color="CCCCCC" w:sz="1"/>
-            </w:tcBorders>
-            <w:shd w:fill="FFFFFF" w:val="clear"/>
-            <w:tcMar>
-              <w:top w:type="dxa" w:w="60"/>
-              <w:left w:type="dxa" w:w="100"/>
-              <w:bottom w:type="dxa" w:w="60"/>
-              <w:right w:type="dxa" w:w="100"/>
-            </w:tcMar>
-          </w:tcPr>
-          <w:p>
-            <w:pPr>
-              <w:spacing w:line="230"/>
-            </w:pPr>
-            <w:r>
-              <w:rPr>
-                <w:rFonts w:ascii="Arial" w:cs="Arial" w:eastAsia="Arial" w:hAnsi="Arial"/>
-                <w:sz w:val="16"/>
-                <w:szCs w:val="16"/>
-              </w:rPr>
-              <w:t xml:space="preserve">A future paid tier is implemented as a check against an existing field rather than requiring a new identity system added retroactively.</w:t>
-            </w:r>
-          </w:p>
-        </w:tc>
-      </w:tr>
-      <w:tr>
-        <w:tc>
-          <w:tcPr>
-            <w:tcW w:type="dxa" w:w="4680"/>
-            <w:tcBorders>
-              <w:top w:val="single" w:color="CCCCCC" w:sz="1"/>
-              <w:left w:val="single" w:color="CCCCCC" w:sz="1"/>
-              <w:bottom w:val="single" w:color="CCCCCC" w:sz="1"/>
-              <w:right w:val="single" w:color="CCCCCC" w:sz="1"/>
-            </w:tcBorders>
-            <w:shd w:fill="F2F2F2" w:val="clear"/>
-            <w:tcMar>
-              <w:top w:type="dxa" w:w="60"/>
-              <w:left w:type="dxa" w:w="100"/>
-              <w:bottom w:type="dxa" w:w="60"/>
-              <w:right w:type="dxa" w:w="100"/>
-            </w:tcMar>
-          </w:tcPr>
-          <w:p>
-            <w:pPr>
-              <w:spacing w:line="230"/>
-            </w:pPr>
-            <w:r>
-              <w:rPr>
-                <w:rFonts w:ascii="Arial" w:cs="Arial" w:eastAsia="Arial" w:hAnsi="Arial"/>
-                <w:sz w:val="16"/>
-                <w:szCs w:val="16"/>
-              </w:rPr>
-              <w:t xml:space="preserve">Implement the production voice pipeline now, configured with a low-cost voice model.</w:t>
-            </w:r>
-          </w:p>
-        </w:tc>
-        <w:tc>
-          <w:tcPr>
-            <w:tcW w:type="dxa" w:w="4680"/>
-            <w:tcBorders>
-              <w:top w:val="single" w:color="CCCCCC" w:sz="1"/>
-              <w:left w:val="single" w:color="CCCCCC" w:sz="1"/>
-              <w:bottom w:val="single" w:color="CCCCCC" w:sz="1"/>
-              <w:right w:val="single" w:color="CCCCCC" w:sz="1"/>
-            </w:tcBorders>
-            <w:shd w:fill="F2F2F2" w:val="clear"/>
-            <w:tcMar>
-              <w:top w:type="dxa" w:w="60"/>
-              <w:left w:type="dxa" w:w="100"/>
-              <w:bottom w:type="dxa" w:w="60"/>
-              <w:right w:type="dxa" w:w="100"/>
-            </w:tcMar>
-          </w:tcPr>
-          <w:p>
-            <w:pPr>
-              <w:spacing w:line="230"/>
-            </w:pPr>
-            <w:r>
-              <w:rPr>
-                <w:rFonts w:ascii="Arial" w:cs="Arial" w:eastAsia="Arial" w:hAnsi="Arial"/>
-                <w:sz w:val="16"/>
-                <w:szCs w:val="16"/>
-              </w:rPr>
-              <w:t xml:space="preserve">Upgrading voice quality later is a configuration change (swap the model reference), not a new integration.</w:t>
-            </w:r>
-          </w:p>
-        </w:tc>
-      </w:tr>
-      <w:tr>
-        <w:tc>
-          <w:tcPr>
-            <w:tcW w:type="dxa" w:w="4680"/>
-            <w:tcBorders>
-              <w:top w:val="single" w:color="CCCCCC" w:sz="1"/>
-              <w:left w:val="single" w:color="CCCCCC" w:sz="1"/>
-              <w:bottom w:val="single" w:color="CCCCCC" w:sz="1"/>
-              <w:right w:val="single" w:color="CCCCCC" w:sz="1"/>
-            </w:tcBorders>
-            <w:shd w:fill="FFFFFF" w:val="clear"/>
-            <w:tcMar>
-              <w:top w:type="dxa" w:w="60"/>
-              <w:left w:type="dxa" w:w="100"/>
-              <w:bottom w:type="dxa" w:w="60"/>
-              <w:right w:type="dxa" w:w="100"/>
-            </w:tcMar>
-          </w:tcPr>
-          <w:p>
-            <w:pPr>
-              <w:spacing w:line="230"/>
-            </w:pPr>
-            <w:r>
-              <w:rPr>
-                <w:rFonts w:ascii="Arial" w:cs="Arial" w:eastAsia="Arial" w:hAnsi="Arial"/>
-                <w:sz w:val="16"/>
-                <w:szCs w:val="16"/>
-              </w:rPr>
-              <w:t xml:space="preserve">Attach a content-version identifier to each world’s deployment package, tracked per session.</w:t>
-            </w:r>
-          </w:p>
-        </w:tc>
-        <w:tc>
-          <w:tcPr>
-            <w:tcW w:type="dxa" w:w="4680"/>
-            <w:tcBorders>
-              <w:top w:val="single" w:color="CCCCCC" w:sz="1"/>
-              <w:left w:val="single" w:color="CCCCCC" w:sz="1"/>
-              <w:bottom w:val="single" w:color="CCCCCC" w:sz="1"/>
-              <w:right w:val="single" w:color="CCCCCC" w:sz="1"/>
-            </w:tcBorders>
-            <w:shd w:fill="FFFFFF" w:val="clear"/>
-            <w:tcMar>
-              <w:top w:type="dxa" w:w="60"/>
-              <w:left w:type="dxa" w:w="100"/>
-              <w:bottom w:type="dxa" w:w="60"/>
-              <w:right w:type="dxa" w:w="100"/>
-            </w:tcMar>
-          </w:tcPr>
-          <w:p>
-            <w:pPr>
-              <w:spacing w:line="230"/>
-            </w:pPr>
-            <w:r>
-              <w:rPr>
-                <w:rFonts w:ascii="Arial" w:cs="Arial" w:eastAsia="Arial" w:hAnsi="Arial"/>
-                <w:sz w:val="16"/>
-                <w:szCs w:val="16"/>
-              </w:rPr>
-              <w:t xml:space="preserve">Enables content updates post-launch without a full application redeploy or disruption to an in-progress session.</w:t>
-            </w:r>
-          </w:p>
-        </w:tc>
-      </w:tr>
-      <w:tr>
-        <w:tc>
-          <w:tcPr>
-            <w:tcW w:type="dxa" w:w="4680"/>
-            <w:tcBorders>
-              <w:top w:val="single" w:color="CCCCCC" w:sz="1"/>
-              <w:left w:val="single" w:color="CCCCCC" w:sz="1"/>
-              <w:bottom w:val="single" w:color="CCCCCC" w:sz="1"/>
-              <w:right w:val="single" w:color="CCCCCC" w:sz="1"/>
-            </w:tcBorders>
-            <w:shd w:fill="F2F2F2" w:val="clear"/>
-            <w:tcMar>
-              <w:top w:type="dxa" w:w="60"/>
-              <w:left w:type="dxa" w:w="100"/>
-              <w:bottom w:type="dxa" w:w="60"/>
-              <w:right w:type="dxa" w:w="100"/>
-            </w:tcMar>
-          </w:tcPr>
-          <w:p>
-            <w:pPr>
-              <w:spacing w:line="230"/>
-            </w:pPr>
-            <w:r>
-              <w:rPr>
-                <w:rFonts w:ascii="Arial" w:cs="Arial" w:eastAsia="Arial" w:hAnsi="Arial"/>
-                <w:sz w:val="16"/>
-                <w:szCs w:val="16"/>
-              </w:rPr>
-              <w:t xml:space="preserve">Define and document a conversation-logging policy (what is logged, retention, access) before Alpha testing begins.</w:t>
-            </w:r>
-          </w:p>
-        </w:tc>
-        <w:tc>
-          <w:tcPr>
-            <w:tcW w:type="dxa" w:w="4680"/>
-            <w:tcBorders>
-              <w:top w:val="single" w:color="CCCCCC" w:sz="1"/>
-              <w:left w:val="single" w:color="CCCCCC" w:sz="1"/>
-              <w:bottom w:val="single" w:color="CCCCCC" w:sz="1"/>
-              <w:right w:val="single" w:color="CCCCCC" w:sz="1"/>
-            </w:tcBorders>
-            <w:shd w:fill="F2F2F2" w:val="clear"/>
-            <w:tcMar>
-              <w:top w:type="dxa" w:w="60"/>
-              <w:left w:type="dxa" w:w="100"/>
-              <w:bottom w:type="dxa" w:w="60"/>
-              <w:right w:type="dxa" w:w="100"/>
-            </w:tcMar>
-          </w:tcPr>
-          <w:p>
-            <w:pPr>
-              <w:spacing w:line="230"/>
-            </w:pPr>
-            <w:r>
-              <w:rPr>
-                <w:rFonts w:ascii="Arial" w:cs="Arial" w:eastAsia="Arial" w:hAnsi="Arial"/>
-                <w:sz w:val="16"/>
-                <w:szCs w:val="16"/>
-              </w:rPr>
-              <w:t xml:space="preserve">Internal QA requires real conversation data for review; participant disclosure cannot be applied retroactively once sessions have occurred.</w:t>
-            </w:r>
-          </w:p>
-        </w:tc>
-      </w:tr>
-    </w:tbl>
-    <w:p>
-      <w:pPr>
-        <w:spacing w:after="0" w:before="120" w:line="230"/>
-      </w:pPr>
-      <w:r>
-        <w:rPr>
-          <w:rFonts w:ascii="Arial" w:cs="Arial" w:eastAsia="Arial" w:hAnsi="Arial"/>
-          <w:i/>
-          <w:iCs/>
-          <w:color w:val="595959"/>
-          <w:sz w:val="15"/>
-          <w:szCs w:val="15"/>
-        </w:rPr>
-        <w:t xml:space="preserve">Full technical rationale for each row is documented in Project-Reference/CiC_Engineering_Considerations_Catalog_V1_0.md — request it directly for the detailed reasoning behind any item.</w:t>
       </w:r>
     </w:p>
     <w:p>

</xml_diff>

<commit_message>
Design Brief: rewrite entire document in engineer/requirements register (System Overview, Design Intent, Governing Content Rule, Functional Requirements); content unchanged
</commit_message>
<xml_diff>
--- a/Ministry/Technology/CiC_FrontEnd_Design_Brief_V1_0.docx
+++ b/Ministry/Technology/CiC_FrontEnd_Design_Brief_V1_0.docx
@@ -33,7 +33,7 @@
           <w:sz w:val="18"/>
           <w:szCs w:val="18"/>
         </w:rPr>
-        <w:t xml:space="preserve">What we want, so you can design it — a companion to the fuller spec, not a replacement</w:t>
+        <w:t xml:space="preserve">Functional and experiential requirements for the front-end implementation — companion to the full specification set, not a replacement for it</w:t>
       </w:r>
     </w:p>
     <w:p>
@@ -51,7 +51,7 @@
           <w:sz w:val="15"/>
           <w:szCs w:val="15"/>
         </w:rPr>
-        <w:t xml:space="preserve">July 2026 · Extended beyond one page to include forward-compatibility requirements — see the Front-End Vision &amp; Phased Plan and Experience Vision documents for full detail</w:t>
+        <w:t xml:space="preserve">July 2026 · Two pages by design, to include forward-compatibility requirements — see the Front-End Vision &amp; Phased Plan and Experience Vision documents for full detail</w:t>
       </w:r>
     </w:p>
     <w:p>
@@ -70,7 +70,7 @@
           <w:sz w:val="21"/>
           <w:szCs w:val="21"/>
         </w:rPr>
-        <w:t xml:space="preserve">What This Is</w:t>
+        <w:t xml:space="preserve">System Overview</w:t>
       </w:r>
     </w:p>
     <w:p>
@@ -83,7 +83,7 @@
           <w:sz w:val="18"/>
           <w:szCs w:val="18"/>
         </w:rPr>
-        <w:t xml:space="preserve">A participant sits at a Table with up to five Representatives — AI voices, each formed by and speaking only from inside one specific historical Christian community — hosted by a neutral Facilitator who governs the conversation without becoming its center. That’s the whole product. No separate "discussion" feature, no chatbot framing, no single authoritative AI voice: an encounter between genuinely distinct historical voices.</w:t>
+        <w:t xml:space="preserve">The system supports a session (“the Table”) in which a participant interacts with up to five independently configured AI agents (“Representatives”), each constrained to generate output only from within a single historical Christian tradition’s formation ecology. A neutral orchestration layer (“the Facilitator”) manages turn-taking and shared context but does not generate Representative content. This is the entire product surface: there is no separate chat/discussion mode, no default general-purpose AI persona, and no direct, unmediated model access.</w:t>
       </w:r>
     </w:p>
     <w:p>
@@ -102,7 +102,7 @@
           <w:sz w:val="21"/>
           <w:szCs w:val="21"/>
         </w:rPr>
-        <w:t xml:space="preserve">The Feeling We’re Building Toward</w:t>
+        <w:t xml:space="preserve">Design Intent</w:t>
       </w:r>
     </w:p>
     <w:p>
@@ -115,7 +115,7 @@
           <w:sz w:val="18"/>
           <w:szCs w:val="18"/>
         </w:rPr>
-        <w:t xml:space="preserve">Picture the Inklings — Lewis and Tolkien meeting late into the evening at the Eagle and Child — reset in an early-church register: unhurried, communal, close to the ground. This is not a theological debate or an exegetical argument. It is engaging conversation — healthy, deep, insightful, challenging, stretching, resonating. The name is deliberate. Every visual and interaction choice below should answer to that feeling, not to typical chat-app conventions.</w:t>
+        <w:t xml:space="preserve">Target tone: unhurried pacing, communal framing, non-hierarchical visual composition. Reference model: an Inklings-style gathering (Lewis, Tolkien, and their circle at the Eagle and Child) — not a theological debate or an exegetical argument, but engaging conversation: healthy, deep, insightful, challenging, stretching, resonating (the source of the product name). This should inform pacing, camera behavior, and copy throughout, not visual styling alone.</w:t>
       </w:r>
     </w:p>
     <w:p>
@@ -134,7 +134,7 @@
           <w:sz w:val="21"/>
           <w:szCs w:val="21"/>
         </w:rPr>
-        <w:t xml:space="preserve">The One Rule Underneath Everything</w:t>
+        <w:t xml:space="preserve">Governing Content Rule</w:t>
       </w:r>
     </w:p>
     <w:p>
@@ -147,7 +147,7 @@
           <w:sz w:val="18"/>
           <w:szCs w:val="18"/>
         </w:rPr>
-        <w:t xml:space="preserve">Only what a world’s own evidence actually supports is shown, spoken, or offered — its vocabulary, the people depicted at its Table, the object in front of a Representative, the experiences it can offer. Where the evidence runs out, the system says so plainly. Nothing is invented to fill a gap — an honest absence is a finding, not a bug.</w:t>
+        <w:t xml:space="preserve">Global invariant, applies to every content-bearing surface: any claim, term, depicted ethnicity, object, or offered experience must be traceable to that world’s documented source evidence. Where evidence is absent, the system states that explicitly rather than defaulting to a generic or invented value. This governs lexicon terms, visual representation, and every future feature listed below.</w:t>
       </w:r>
     </w:p>
     <w:p>
@@ -179,7 +179,7 @@
           <w:sz w:val="18"/>
           <w:szCs w:val="18"/>
         </w:rPr>
-        <w:t xml:space="preserve">Phase 1 ships five worlds, but the implementation should not assume five is the ceiling. The roadmap below is out of scope for Phase 1 delivery; it is in scope for Phase 1 architecture — the data model and interfaces need to accommodate it without requiring a breaking change or rebuild when it arrives.</w:t>
+        <w:t xml:space="preserve">Phase 1 ships five worlds; the implementation should not assume five is the ceiling. The roadmap below is out of scope for Phase 1 delivery and in scope for Phase 1 architecture — the data model and interfaces need to accommodate it without a breaking change or rebuild when it arrives.</w:t>
       </w:r>
     </w:p>
     <w:p>
@@ -205,7 +205,7 @@
           <w:sz w:val="18"/>
           <w:szCs w:val="18"/>
         </w:rPr>
-        <w:t xml:space="preserve">Clicking into a world eventually opens four choices, not one: Description, Tour, Choose for Table, and Academic Documents. Only Choose for Table is real at Phase 1. Academic Documents is a future standalone feature — raw, unmodified browsing of a world’s full lexicon, story repository, and source documents, independent of any conversation, distinct from the in-conversation hover/click (which stays free for everyone, permanently — a constitutional guarantee, never gated). Tours is a Representative guiding a participant through pictures of their world, potentially a church service or the Eucharist, bounded by the same evidence rule as everything else. Today’s "first pass" voice matures into fully culturally- and gender-matched, multilingual text-to-speech as funding allows.</w:t>
+        <w:t xml:space="preserve">Clicking into a world eventually opens four choices, not one: Description, Tour, Choose for Table, and Academic Documents. Only Choose for Table is implemented at Phase 1; the remaining three render as visibly disabled menu items. Academic Documents is a future standalone feature — raw, unmodified browsing of a world’s full lexicon, story repository, and source documents, independent of any conversation, distinct from the in-conversation hover/click (which stays free for everyone, permanently — a constitutional guarantee, never gated). Tours is a Representative guiding a participant through pictures of their world, potentially a church service or the Eucharist, bounded by the same evidence rule as everything else. The Phase 1 voice implementation is expected to be superseded by fully culturally- and gender-matched, multilingual text-to-speech as funding allows.</w:t>
       </w:r>
     </w:p>
     <w:p>
@@ -218,7 +218,7 @@
           <w:sz w:val="18"/>
           <w:szCs w:val="18"/>
         </w:rPr>
-        <w:t xml:space="preserve">On funding: the core conversation stays free for everyone, donor-funded, permanently — that’s a constitutional guarantee, not a pricing choice that might change. A future paid tier may eventually unlock deeper pastor and academic tooling (Tours, sermon-prep material, Academic Documents) on top of that free core. That means some notion of user identity or entitlement is worth existing early, even completely unused at Phase 1.</w:t>
+        <w:t xml:space="preserve">On funding: the core conversation stays free for everyone, donor-funded, permanently — a constitutional guarantee, not a pricing choice that might change. A future paid tier may eventually unlock deeper pastor and academic tooling (Tours, sermon-prep material, Academic Documents) on top of that free core. Some notion of user identity or entitlement is therefore worth including early, even if completely unused at Phase 1.</w:t>
       </w:r>
     </w:p>
     <w:p>
@@ -819,7 +819,7 @@
           <w:sz w:val="21"/>
           <w:szCs w:val="21"/>
         </w:rPr>
-        <w:t xml:space="preserve">The Experience, Compressed</w:t>
+        <w:t xml:space="preserve">Functional Requirements — Core Experience</w:t>
       </w:r>
     </w:p>
     <w:p>
@@ -837,7 +837,7 @@
           <w:sz w:val="18"/>
           <w:szCs w:val="18"/>
         </w:rPr>
-        <w:t xml:space="preserve">Landing: an evocative Table — warm light, waiting seats, no Representatives until a world is chosen — but not an empty room. The Facilitator is already there, the one figure present, to greet the participant and offer the choices below. Three entry paths shown with equal weight: jump straight to a question, browse and pick worlds yourself, or let the Facilitator ask a few questions and choose for you. A quiet fourth option, “Ask the Facilitator,” lets a skeptical visitor interrogate the project before committing to anything.</w:t>
+        <w:t xml:space="preserve">Entry state: default view renders the Table environment (ambient lighting, unoccupied seats) with no Representative instances loaded; the Facilitator is rendered as present from initial load. Three entry flows, equal-weighted in the UI: (1) direct message input, bypassing world selection; (2) manual selection from a browsable world list; (3) guided selection, in which the Facilitator elicits input via short dialogue and selects worlds algorithmically. A fourth, secondary entry point ("Ask the Facilitator") supports pre-commitment Q&amp;A, handled by the same Facilitator persona rather than a separate agent.</w:t>
       </w:r>
     </w:p>
     <w:p>
@@ -855,7 +855,7 @@
           <w:sz w:val="18"/>
           <w:szCs w:val="18"/>
         </w:rPr>
-        <w:t xml:space="preserve">Sitting down: one static background image, up to five figures at the Table in clothing typical of their world; ethnicity and diversity follow that world’s own evidence, never defaulted, never invented. Each figure holds whatever object was typical of their world’s expression of faith — or nothing, when the evidence supports nothing.</w:t>
+        <w:t xml:space="preserve">Table rendering: single static background image containing up to five figures, one per active Representative, in period-appropriate attire. Demographic representation is data-driven from each world’s source-ecology record, not defaulted or randomized. Each figure may render an associated object, sourced from the same record; absence of an attested object is a valid, expected state — not an error condition or a placeholder to fill.</w:t>
       </w:r>
     </w:p>
     <w:p>
@@ -873,7 +873,7 @@
           <w:sz w:val="18"/>
           <w:szCs w:val="18"/>
         </w:rPr>
-        <w:t xml:space="preserve">Motion, not animation, at first: camera zoom to whoever’s speaking, a pan between two Representatives mid-exchange, a widen when the participant addresses the whole Table — following the same turn-taking the Facilitator already governs.</w:t>
+        <w:t xml:space="preserve">Camera behavior: static image with programmatic pan/zoom driven by active-speaker state — zoom on current speaker, pan between two Representatives during an exchange, zoom-out on whole-Table address. Camera state should derive from the same turn-taking state the Facilitator already maintains, not a separate signal.</w:t>
       </w:r>
     </w:p>
     <w:p>
@@ -891,7 +891,7 @@
           <w:sz w:val="18"/>
           <w:szCs w:val="18"/>
         </w:rPr>
-        <w:t xml:space="preserve">Conversation: typed text in a dialogue box at the center of the scene — the permanent core of the experience, not a placeholder for voice. Voice is a real, additive goal (culturally- and gender-matched text-to-speech), gated by cost today, not by architecture.</w:t>
+        <w:t xml:space="preserve">Primary interaction surface: text input/output in a persistent dialogue panel. This is not a placeholder pending a voice-first interface — text is the permanent primary UI layer regardless of voice feature maturity (see Constraints). Voice output (TTS) is an additive layer, not a replacement path.</w:t>
       </w:r>
     </w:p>
     <w:p>
@@ -909,7 +909,7 @@
           <w:sz w:val="18"/>
           <w:szCs w:val="18"/>
         </w:rPr>
-        <w:t xml:space="preserve">Reading the sources: terms, stories, and quotes specific to a world are highlighted in the dialogue text. Hover gives a short, plain-language explanation; click opens the full lexicon and source detail. One consistent interaction pattern for anything carrying a confidence level — never a different treatment per content type.</w:t>
+        <w:t xml:space="preserve">Inline annotation: terms, quotes, and narrative elements carrying a confidence rating are marked up in the dialogue text. Hover triggers a short tooltip (plain-language summary); click opens a detail view (full lexicon/source entry). Implement one uniform interaction pattern across all annotated content types — do not implement per-type variants.</w:t>
       </w:r>
     </w:p>
     <w:p>
@@ -1578,7 +1578,7 @@
           <w:sz w:val="21"/>
           <w:szCs w:val="21"/>
         </w:rPr>
-        <w:t xml:space="preserve">Design Constraints Worth Knowing Before You Start</w:t>
+        <w:t xml:space="preserve">Constraints</w:t>
       </w:r>
     </w:p>
     <w:p>
@@ -1632,7 +1632,7 @@
           <w:sz w:val="18"/>
           <w:szCs w:val="18"/>
         </w:rPr>
-        <w:t xml:space="preserve">The requirements above (Roadmap Context) are forward-compatibility constraints on the Phase 1 implementation, not optional scope — treat them as non-functional requirements alongside the functional spec.</w:t>
+        <w:t xml:space="preserve">The requirements under Roadmap Context are forward-compatibility constraints on the Phase 1 implementation, not optional scope — treat them as non-functional requirements alongside the functional spec above.</w:t>
       </w:r>
     </w:p>
     <w:sectPr>

</xml_diff>

<commit_message>
Design Brief: fix Academic Documents governance caveat and Alpha-scope clarification
- Academic Documents funding paragraph now states gating is an open
  governance dependency (Article 30 carve-out not yet made), not a
  settled decision, per 2026-07-07 decision log entry.
- Entry-state functional requirement now explicitly scopes Bypass-only
  to Alpha vs. full three-pathway portal to Phase 1, cited to Table
  Design Document Section 11.
- New open-question note added before Build Order table: Facilitator
  multi-Representative orchestration scope at Alpha is not addressed
  by any governing document and is flagged for Mark's decision.
- Decision log updated with verification trail for both fixes.
</commit_message>
<xml_diff>
--- a/Ministry/Technology/CiC_FrontEnd_Design_Brief_V1_0.docx
+++ b/Ministry/Technology/CiC_FrontEnd_Design_Brief_V1_0.docx
@@ -218,7 +218,7 @@
           <w:sz w:val="18"/>
           <w:szCs w:val="18"/>
         </w:rPr>
-        <w:t xml:space="preserve">On funding: the core conversation stays free for everyone, donor-funded, permanently — a constitutional guarantee, not a pricing choice that might change. A future paid tier may eventually unlock deeper pastor and academic tooling (Tours, sermon-prep material, Academic Documents) on top of that free core. Some notion of user identity or entitlement is therefore worth including early, even if completely unused at Phase 1.</w:t>
+        <w:t xml:space="preserve">On funding: the core conversation stays free for everyone, donor-funded, permanently — a constitutional guarantee, not a pricing choice that might change. A future paid tier may eventually unlock deeper pastor and academic tooling on top of that free core. Tours and sermon-prep material are clean cases — experience/productivity features, not evidentiary access. Academic Documents is not: per the 2026-07-07 Decision Log, gating it is defensible but sits close enough to Article 30’s transparency guarantee that it requires an explicit constitutional carve-out before being built as a paid feature, and that carve-out has not yet been made. Treat Academic Documents’ gating as an open governance dependency, not a settled product decision. Some notion of user identity or entitlement is nonetheless worth including early, even if completely unused at Phase 1.</w:t>
       </w:r>
     </w:p>
     <w:p>
@@ -837,7 +837,7 @@
           <w:sz w:val="18"/>
           <w:szCs w:val="18"/>
         </w:rPr>
-        <w:t xml:space="preserve">Entry state: default view renders the Table environment (ambient lighting, unoccupied seats) with no Representative instances loaded; the Facilitator is rendered as present from initial load. Three entry flows, equal-weighted in the UI: (1) direct message input, bypassing world selection; (2) manual selection from a browsable world list; (3) guided selection, in which the Facilitator elicits input via short dialogue and selects worlds algorithmically. A fourth, secondary entry point ("Ask the Facilitator") supports pre-commitment Q&amp;A, handled by the same Facilitator persona rather than a separate agent.</w:t>
+        <w:t xml:space="preserve">Entry state, full scope (Phase 1): default view renders the Table environment (ambient lighting, unoccupied seats) with no Representative instances loaded; the Facilitator is rendered as present from initial load. Three entry flows, equal-weighted in the UI: (1) direct message input, bypassing world selection ("Bypass"); (2) manual selection from a browsable world list ("Build Your Own Table"); (3) guided selection, in which the Facilitator elicits input via short dialogue and selects worlds algorithmically ("Guided Onboarding"). A fourth, secondary entry point ("Ask the Facilitator") supports pre-commitment Q&amp;A, handled by the same Facilitator persona rather than a separate agent. Per Table Design Document Section 11: Alpha implements Bypass only, with basic role selection — the full three-pathway portal, including world browsing, is deferred through Beta and delivered at Phase 1.</w:t>
       </w:r>
     </w:p>
     <w:p>
@@ -910,6 +910,22 @@
           <w:szCs w:val="18"/>
         </w:rPr>
         <w:t xml:space="preserve">Inline annotation: terms, quotes, and narrative elements carrying a confidence rating are marked up in the dialogue text. Hover triggers a short tooltip (plain-language summary); click opens a detail view (full lexicon/source entry). Implement one uniform interaction pattern across all annotated content types — do not implement per-type variants.</w:t>
+      </w:r>
+    </w:p>
+    <w:p>
+      <w:pPr>
+        <w:spacing w:after="0" w:before="120" w:line="230"/>
+      </w:pPr>
+      <w:r>
+        <w:rPr>
+          <w:rFonts w:ascii="Arial" w:cs="Arial" w:eastAsia="Arial" w:hAnsi="Arial"/>
+          <w:i/>
+          <w:iCs/>
+          <w:color w:val="595959"/>
+          <w:sz w:val="15"/>
+          <w:szCs w:val="15"/>
+        </w:rPr>
+        <w:t xml:space="preserve">Open scope question, not resolved by the governing design documents: Table Design Document Section 11 specifies world count at Alpha (one to three) and confirms entry-pathway scope (Bypass only, above), but is silent on whether full multi-Representative Facilitator orchestration (turn-taking across concurrent Representatives, cross-world drift monitoring) is required at Alpha or can be deferred to Beta. This materially affects Alpha engineering scope and should be resolved before Alpha is estimated.</w:t>
       </w:r>
     </w:p>
     <w:p>
@@ -1560,6 +1576,22 @@
           <w:szCs w:val="15"/>
         </w:rPr>
         <w:t xml:space="preserve">Beyond Phase 1: richer multilingual voice casting and role-based emphasis layer in on an ongoing track as funding allows; the eventual Ultimate Vision adds a full world timeline spanning history, cross-era Tables, and guided "Tours" of a world’s worship life — bounded by the same evidentiary rule above.</w:t>
+      </w:r>
+    </w:p>
+    <w:p>
+      <w:pPr>
+        <w:spacing w:after="0" w:before="120" w:line="230"/>
+      </w:pPr>
+      <w:r>
+        <w:rPr>
+          <w:rFonts w:ascii="Arial" w:cs="Arial" w:eastAsia="Arial" w:hAnsi="Arial"/>
+          <w:i/>
+          <w:iCs/>
+          <w:color w:val="595959"/>
+          <w:sz w:val="15"/>
+          <w:szCs w:val="15"/>
+        </w:rPr>
+        <w:t xml:space="preserve">Entry-pathway scope (Bypass only at Alpha; full three-pathway portal at Phase 1) is detailed under Functional Requirements above, not repeated in this table.</w:t>
       </w:r>
     </w:p>
     <w:p>

</xml_diff>